<commit_message>
Deployed 74ce553d with MkDocs version: 1.6.1
</commit_message>
<xml_diff>
--- a/大三春夏/汽车设计/设计作业.docx
+++ b/大三春夏/汽车设计/设计作业.docx
@@ -1293,14 +1293,6 @@
         <w:gridCol w:w="2316"/>
       </w:tblGrid>
       <w:tr>
-        <w:tblPrEx>
-          <w:tblCellMar>
-            <w:top w:w="0" w:type="dxa"/>
-            <w:left w:w="108" w:type="dxa"/>
-            <w:bottom w:w="0" w:type="dxa"/>
-            <w:right w:w="108" w:type="dxa"/>
-          </w:tblCellMar>
-        </w:tblPrEx>
         <w:trPr>
           <w:tblHeader/>
         </w:trPr>
@@ -3179,7 +3171,7 @@
         </w:tblCellMar>
       </w:tblPr>
       <w:tblGrid>
-        <w:gridCol w:w="1416"/>
+        <w:gridCol w:w="1421"/>
         <w:gridCol w:w="2496"/>
       </w:tblGrid>
       <w:tr>
@@ -7688,6 +7680,10 @@
     <w:p>
       <w:pPr>
         <w:pStyle w:val="3"/>
+        <w:rPr>
+          <w:rFonts w:hint="default" w:eastAsia="宋体"/>
+          <w:lang w:val="en-US" w:eastAsia="zh-CN"/>
+        </w:rPr>
       </w:pPr>
       <w:r>
         <w:rPr>
@@ -7772,6 +7768,13 @@
       </w:r>
       <w:r>
         <w:t>)</w:t>
+      </w:r>
+      <w:r>
+        <w:rPr>
+          <w:rFonts w:hint="eastAsia"/>
+          <w:lang w:val="en-US" w:eastAsia="zh-CN"/>
+        </w:rPr>
+        <w:t>nn</w:t>
       </w:r>
     </w:p>
     <w:p>
@@ -10003,6 +10006,13 @@
       <w:r>
         <w:rPr>
           <w:rFonts w:hint="eastAsia"/>
+          <w:lang w:val="en-US" w:eastAsia="zh-CN"/>
+        </w:rPr>
+        <w:t>9</w:t>
+      </w:r>
+      <w:r>
+        <w:rPr>
+          <w:rFonts w:hint="eastAsia"/>
         </w:rPr>
         <w:t>转向系设计</w:t>
       </w:r>
@@ -10044,8 +10054,10 @@
         <w:rPr>
           <w:rFonts w:hint="eastAsia"/>
         </w:rPr>
-        <w:t>吨级轻卡，我建议写：</w:t>
-      </w:r>
+        <w:t>吨级轻卡</w:t>
+      </w:r>
+      <w:bookmarkStart w:id="44" w:name="_GoBack"/>
+      <w:bookmarkEnd w:id="44"/>
     </w:p>
     <w:p>
       <w:pPr>
@@ -11956,15 +11968,7 @@
         <w:rPr>
           <w:rFonts w:hint="eastAsia"/>
         </w:rPr>
-        <w:t>制动能量回收可以在城市频繁启停工况下</w:t>
-      </w:r>
-      <w:bookmarkStart w:id="44" w:name="_GoBack"/>
-      <w:bookmarkEnd w:id="44"/>
-      <w:r>
-        <w:rPr>
-          <w:rFonts w:hint="eastAsia"/>
-        </w:rPr>
-        <w:t>降低电耗，提升续航表现。</w:t>
+        <w:t>制动能量回收可以在城市频繁启停工况下降低电耗，提升续航表现。</w:t>
       </w:r>
     </w:p>
     <w:p>

</xml_diff>

<commit_message>
Deployed 96c91acf with MkDocs version: 1.6.1
</commit_message>
<xml_diff>
--- a/大三春夏/汽车设计/设计作业.docx
+++ b/大三春夏/汽车设计/设计作业.docx
@@ -690,7 +690,7 @@
         </w:tblCellMar>
       </w:tblPr>
       <w:tblGrid>
-        <w:gridCol w:w="1833"/>
+        <w:gridCol w:w="1783"/>
         <w:gridCol w:w="2256"/>
       </w:tblGrid>
       <w:tr>
@@ -923,14 +923,6 @@
         </w:tc>
       </w:tr>
       <w:tr>
-        <w:tblPrEx>
-          <w:tblCellMar>
-            <w:top w:w="0" w:type="dxa"/>
-            <w:left w:w="108" w:type="dxa"/>
-            <w:bottom w:w="0" w:type="dxa"/>
-            <w:right w:w="108" w:type="dxa"/>
-          </w:tblCellMar>
-        </w:tblPrEx>
         <w:tc>
           <w:p>
             <w:pPr>
@@ -1026,18 +1018,10 @@
         </w:tblCellMar>
       </w:tblPr>
       <w:tblGrid>
-        <w:gridCol w:w="1416"/>
+        <w:gridCol w:w="1421"/>
         <w:gridCol w:w="2376"/>
       </w:tblGrid>
       <w:tr>
-        <w:tblPrEx>
-          <w:tblCellMar>
-            <w:top w:w="0" w:type="dxa"/>
-            <w:left w:w="108" w:type="dxa"/>
-            <w:bottom w:w="0" w:type="dxa"/>
-            <w:right w:w="108" w:type="dxa"/>
-          </w:tblCellMar>
-        </w:tblPrEx>
         <w:trPr>
           <w:tblHeader/>
         </w:trPr>
@@ -1218,14 +1202,6 @@
         </w:tc>
       </w:tr>
       <w:tr>
-        <w:tblPrEx>
-          <w:tblCellMar>
-            <w:top w:w="0" w:type="dxa"/>
-            <w:left w:w="108" w:type="dxa"/>
-            <w:bottom w:w="0" w:type="dxa"/>
-            <w:right w:w="108" w:type="dxa"/>
-          </w:tblCellMar>
-        </w:tblPrEx>
         <w:tc>
           <w:p>
             <w:pPr>
@@ -1289,10 +1265,18 @@
         </w:tblCellMar>
       </w:tblPr>
       <w:tblGrid>
-        <w:gridCol w:w="1656"/>
+        <w:gridCol w:w="1662"/>
         <w:gridCol w:w="2316"/>
       </w:tblGrid>
       <w:tr>
+        <w:tblPrEx>
+          <w:tblCellMar>
+            <w:top w:w="0" w:type="dxa"/>
+            <w:left w:w="108" w:type="dxa"/>
+            <w:bottom w:w="0" w:type="dxa"/>
+            <w:right w:w="108" w:type="dxa"/>
+          </w:tblCellMar>
+        </w:tblPrEx>
         <w:trPr>
           <w:tblHeader/>
         </w:trPr>
@@ -1359,14 +1343,6 @@
         </w:tc>
       </w:tr>
       <w:tr>
-        <w:tblPrEx>
-          <w:tblCellMar>
-            <w:top w:w="0" w:type="dxa"/>
-            <w:left w:w="108" w:type="dxa"/>
-            <w:bottom w:w="0" w:type="dxa"/>
-            <w:right w:w="108" w:type="dxa"/>
-          </w:tblCellMar>
-        </w:tblPrEx>
         <w:tc>
           <w:p>
             <w:pPr>
@@ -1547,7 +1523,7 @@
         </w:tblCellMar>
       </w:tblPr>
       <w:tblGrid>
-        <w:gridCol w:w="1176"/>
+        <w:gridCol w:w="1180"/>
         <w:gridCol w:w="2376"/>
         <w:gridCol w:w="696"/>
       </w:tblGrid>
@@ -2091,8 +2067,8 @@
         </w:tblCellMar>
       </w:tblPr>
       <w:tblGrid>
-        <w:gridCol w:w="1209"/>
-        <w:gridCol w:w="7647"/>
+        <w:gridCol w:w="1189"/>
+        <w:gridCol w:w="7667"/>
       </w:tblGrid>
       <w:tr>
         <w:tblPrEx>
@@ -2832,7 +2808,7 @@
         </w:tblCellMar>
       </w:tblPr>
       <w:tblGrid>
-        <w:gridCol w:w="1833"/>
+        <w:gridCol w:w="1783"/>
         <w:gridCol w:w="2616"/>
       </w:tblGrid>
       <w:tr>
@@ -3399,7 +3375,7 @@
         </w:tblCellMar>
       </w:tblPr>
       <w:tblGrid>
-        <w:gridCol w:w="1833"/>
+        <w:gridCol w:w="1783"/>
         <w:gridCol w:w="2436"/>
       </w:tblGrid>
       <w:tr>
@@ -3668,9 +3644,9 @@
         </w:tblCellMar>
       </w:tblPr>
       <w:tblGrid>
-        <w:gridCol w:w="1176"/>
+        <w:gridCol w:w="1180"/>
         <w:gridCol w:w="2856"/>
-        <w:gridCol w:w="1352"/>
+        <w:gridCol w:w="1296"/>
       </w:tblGrid>
       <w:tr>
         <w:tblPrEx>
@@ -4618,55 +4594,22 @@
     <w:p>
       <w:pPr>
         <w:pStyle w:val="3"/>
-      </w:pPr>
-      <w:r>
-        <w:rPr>
-          <w:rFonts w:hint="eastAsia"/>
-        </w:rPr>
-        <w:t>本车定位为面向城市配送、快递运输、商超配送和短途城际物流的纯电动厢式轻卡。车辆采用</w:t>
-      </w:r>
-      <w:r>
-        <w:rPr>
-          <w:rFonts w:hint="eastAsia"/>
-          <w:b/>
-          <w:bCs/>
-        </w:rPr>
-        <w:t>单电机后驱</w:t>
-      </w:r>
-      <w:r>
-        <w:rPr>
-          <w:b/>
-          <w:bCs/>
-        </w:rPr>
+        <w:bidi w:val="0"/>
+      </w:pPr>
+      <w:r>
+        <w:rPr>
+          <w:rFonts w:hint="eastAsia"/>
+        </w:rPr>
+        <w:t>本车定位为面向城市配送、快递运输、商超配送和短途城际物流的纯电动厢式轻卡。车辆采用单电机后驱</w:t>
+      </w:r>
+      <w:r>
         <w:t>/</w:t>
       </w:r>
       <w:r>
         <w:rPr>
           <w:rFonts w:hint="eastAsia"/>
-          <w:b/>
-          <w:bCs/>
-        </w:rPr>
-        <w:t>电驱桥方案</w:t>
-      </w:r>
-      <w:r>
-        <w:rPr>
-          <w:rFonts w:hint="eastAsia"/>
-        </w:rPr>
-        <w:t>，匹配磷酸铁锂动力电池和单级减速机构，重点满足城市物流场景下的</w:t>
-      </w:r>
-      <w:r>
-        <w:rPr>
-          <w:rFonts w:hint="eastAsia"/>
-          <w:b/>
-          <w:bCs/>
-        </w:rPr>
-        <w:t>续航、载重、爬坡、经济性和低排放</w:t>
-      </w:r>
-      <w:r>
-        <w:rPr>
-          <w:rFonts w:hint="eastAsia"/>
-        </w:rPr>
-        <w:t>需求。</w:t>
+        </w:rPr>
+        <w:t>电驱桥方案，匹配磷酸铁锂动力电池和单级减速机构，重点满足城市物流场景下的续航、载重、爬坡、经济性和低排放需求。</w:t>
       </w:r>
     </w:p>
     <w:p>
@@ -4735,6 +4678,7 @@
     <w:p>
       <w:pPr>
         <w:pStyle w:val="3"/>
+        <w:bidi w:val="0"/>
       </w:pPr>
       <w:r>
         <w:rPr>
@@ -4776,36 +4720,13 @@
         <w:rPr>
           <w:rFonts w:hint="eastAsia"/>
         </w:rPr>
-        <w:t>kg，接近该级别上限。(</w:t>
-      </w:r>
-      <w:r>
-        <w:fldChar w:fldCharType="begin"/>
-      </w:r>
-      <w:r>
-        <w:instrText xml:space="preserve"> HYPERLINK "https://www.cntplus.com/truck/11421.html?utm_source=chatgpt.com" \h </w:instrText>
-      </w:r>
-      <w:r>
-        <w:fldChar w:fldCharType="separate"/>
-      </w:r>
-      <w:r>
-        <w:rPr>
-          <w:rStyle w:val="21"/>
-        </w:rPr>
-        <w:t>cntplus.com</w:t>
-      </w:r>
-      <w:r>
-        <w:rPr>
-          <w:rStyle w:val="21"/>
-        </w:rPr>
-        <w:fldChar w:fldCharType="end"/>
-      </w:r>
-      <w:r>
-        <w:t>)</w:t>
+        <w:t>kg，接近该级别上限。</w:t>
       </w:r>
     </w:p>
     <w:p>
       <w:pPr>
         <w:pStyle w:val="3"/>
+        <w:bidi w:val="0"/>
       </w:pPr>
       <w:r>
         <w:rPr>
@@ -4859,31 +4780,7 @@
         <w:t>kW，电池容量</w:t>
       </w:r>
       <w:r>
-        <w:t>100kWh。(</w:t>
-      </w:r>
-      <w:r>
-        <w:fldChar w:fldCharType="begin"/>
-      </w:r>
-      <w:r>
-        <w:instrText xml:space="preserve"> HYPERLINK "https://product.360che.com/m805/201414_index.html?utm_source=chatgpt.com" \h </w:instrText>
-      </w:r>
-      <w:r>
-        <w:fldChar w:fldCharType="separate"/>
-      </w:r>
-      <w:r>
-        <w:rPr>
-          <w:rStyle w:val="21"/>
-        </w:rPr>
-        <w:t>product.360che.com</w:t>
-      </w:r>
-      <w:r>
-        <w:rPr>
-          <w:rStyle w:val="21"/>
-        </w:rPr>
-        <w:fldChar w:fldCharType="end"/>
-      </w:r>
-      <w:r>
-        <w:t>)</w:t>
+        <w:t>100kWh。</w:t>
       </w:r>
       <w:r>
         <w:rPr>
@@ -4937,31 +4834,7 @@
         <w:t>kW，CLTC续航里程</w:t>
       </w:r>
       <w:r>
-        <w:t>300km。(</w:t>
-      </w:r>
-      <w:r>
-        <w:fldChar w:fldCharType="begin"/>
-      </w:r>
-      <w:r>
-        <w:instrText xml:space="preserve"> HYPERLINK "https://product.360che.com/m756/189051_index.html?utm_source=chatgpt.com" \h </w:instrText>
-      </w:r>
-      <w:r>
-        <w:fldChar w:fldCharType="separate"/>
-      </w:r>
-      <w:r>
-        <w:rPr>
-          <w:rStyle w:val="21"/>
-        </w:rPr>
-        <w:t>product.360che.com</w:t>
-      </w:r>
-      <w:r>
-        <w:rPr>
-          <w:rStyle w:val="21"/>
-        </w:rPr>
-        <w:fldChar w:fldCharType="end"/>
-      </w:r>
-      <w:r>
-        <w:t>)</w:t>
+        <w:t>300km。</w:t>
       </w:r>
       <w:r>
         <w:rPr>
@@ -5015,56 +4888,21 @@
         <w:t>kW，电池容量</w:t>
       </w:r>
       <w:r>
-        <w:t>81.14kWh。(</w:t>
-      </w:r>
-      <w:r>
-        <w:fldChar w:fldCharType="begin"/>
-      </w:r>
-      <w:r>
-        <w:instrText xml:space="preserve"> HYPERLINK "https://product.360che.com/m657/164394_index.html?utm_source=chatgpt.com" \h </w:instrText>
-      </w:r>
-      <w:r>
-        <w:fldChar w:fldCharType="separate"/>
-      </w:r>
-      <w:r>
-        <w:rPr>
-          <w:rStyle w:val="21"/>
-        </w:rPr>
-        <w:t>product.360che.com</w:t>
-      </w:r>
-      <w:r>
-        <w:rPr>
-          <w:rStyle w:val="21"/>
-        </w:rPr>
-        <w:fldChar w:fldCharType="end"/>
-      </w:r>
-      <w:r>
-        <w:t>)</w:t>
+        <w:t>81.14kWh。</w:t>
       </w:r>
     </w:p>
     <w:p>
       <w:pPr>
         <w:pStyle w:val="3"/>
-      </w:pPr>
-      <w:r>
-        <w:rPr>
-          <w:rFonts w:hint="eastAsia"/>
-        </w:rPr>
-        <w:t>因此，本设计采用</w:t>
-      </w:r>
-      <w:r>
-        <w:rPr>
-          <w:rFonts w:hint="eastAsia"/>
-          <w:b/>
-          <w:bCs/>
-        </w:rPr>
-        <w:t>比亚迪T5EV、福田奥铃智蓝EL-Plus、远程星智</w:t>
-      </w:r>
-      <w:r>
-        <w:rPr>
-          <w:b/>
-          <w:bCs/>
-        </w:rPr>
+        <w:bidi w:val="0"/>
+      </w:pPr>
+      <w:r>
+        <w:rPr>
+          <w:rFonts w:hint="eastAsia"/>
+        </w:rPr>
+        <w:t>因此，本设计采用比亚迪T5EV、福田奥铃智蓝EL-Plus、远程星智</w:t>
+      </w:r>
+      <w:r>
         <w:t>H8E</w:t>
       </w:r>
       <w:r>
@@ -5417,7 +5255,7 @@
       </w:tblPr>
       <w:tblGrid>
         <w:gridCol w:w="1656"/>
-        <w:gridCol w:w="2496"/>
+        <w:gridCol w:w="1956"/>
       </w:tblGrid>
       <w:tr>
         <w:tblPrEx>
@@ -5633,7 +5471,14 @@
               <w:pStyle w:val="25"/>
             </w:pPr>
             <w:r>
-              <w:t>90km/h</w:t>
+              <w:rPr>
+                <w:rFonts w:hint="eastAsia"/>
+                <w:lang w:val="en-US" w:eastAsia="zh-CN"/>
+              </w:rPr>
+              <w:t>100</w:t>
+            </w:r>
+            <w:r>
+              <w:t>km/h</w:t>
             </w:r>
           </w:p>
         </w:tc>
@@ -5815,15 +5660,6 @@
               </w:rPr>
               <w:t>后置电机后驱</w:t>
             </w:r>
-            <w:r>
-              <w:t>/</w:t>
-            </w:r>
-            <w:r>
-              <w:rPr>
-                <w:rFonts w:hint="eastAsia"/>
-              </w:rPr>
-              <w:t>电驱桥</w:t>
-            </w:r>
           </w:p>
         </w:tc>
       </w:tr>
@@ -5870,6 +5706,7 @@
     <w:p>
       <w:pPr>
         <w:pStyle w:val="3"/>
+        <w:bidi w:val="0"/>
       </w:pPr>
       <w:r>
         <w:rPr>
@@ -5981,9 +5818,9 @@
         </w:tblCellMar>
       </w:tblPr>
       <w:tblGrid>
-        <w:gridCol w:w="984"/>
-        <w:gridCol w:w="1465"/>
-        <w:gridCol w:w="6407"/>
+        <w:gridCol w:w="1210"/>
+        <w:gridCol w:w="1690"/>
+        <w:gridCol w:w="5956"/>
       </w:tblGrid>
       <w:tr>
         <w:tblPrEx>
@@ -6162,33 +5999,6 @@
               </w:rPr>
               <w:t>轻卡平台参考</w:t>
             </w:r>
-            <w:r>
-              <w:t>(</w:t>
-            </w:r>
-            <w:r>
-              <w:fldChar w:fldCharType="begin"/>
-            </w:r>
-            <w:r>
-              <w:instrText xml:space="preserve"> HYPERLINK "https://product.360che.com/m805/201411_param.html?utm_source=chatgpt.com" \h </w:instrText>
-            </w:r>
-            <w:r>
-              <w:fldChar w:fldCharType="separate"/>
-            </w:r>
-            <w:r>
-              <w:rPr>
-                <w:rStyle w:val="21"/>
-              </w:rPr>
-              <w:t>product.360che.com</w:t>
-            </w:r>
-            <w:r>
-              <w:rPr>
-                <w:rStyle w:val="21"/>
-              </w:rPr>
-              <w:fldChar w:fldCharType="end"/>
-            </w:r>
-            <w:r>
-              <w:t>)</w:t>
-            </w:r>
           </w:p>
         </w:tc>
       </w:tr>
@@ -6253,33 +6063,6 @@
               </w:rPr>
               <w:t>吨</w:t>
             </w:r>
-            <w:r>
-              <w:t>(</w:t>
-            </w:r>
-            <w:r>
-              <w:fldChar w:fldCharType="begin"/>
-            </w:r>
-            <w:r>
-              <w:instrText xml:space="preserve"> HYPERLINK "https://product.360che.com/m805/201414_index.html?utm_source=chatgpt.com" \h </w:instrText>
-            </w:r>
-            <w:r>
-              <w:fldChar w:fldCharType="separate"/>
-            </w:r>
-            <w:r>
-              <w:rPr>
-                <w:rStyle w:val="21"/>
-              </w:rPr>
-              <w:t>product.360che.com</w:t>
-            </w:r>
-            <w:r>
-              <w:rPr>
-                <w:rStyle w:val="21"/>
-              </w:rPr>
-              <w:fldChar w:fldCharType="end"/>
-            </w:r>
-            <w:r>
-              <w:t>)</w:t>
-            </w:r>
           </w:p>
         </w:tc>
       </w:tr>
@@ -6313,12 +6096,498 @@
             <w:r>
               <w:rPr>
                 <w:rFonts w:hint="eastAsia"/>
-              </w:rPr>
-              <w:t>约</w:t>
+                <w:lang w:val="en-US" w:eastAsia="zh-CN"/>
+              </w:rPr>
+              <w:t>2940</w:t>
+            </w:r>
+            <w:r>
+              <w:t>kg</w:t>
+            </w:r>
+          </w:p>
+        </w:tc>
+        <w:tc>
+          <w:p>
+            <w:pPr>
+              <w:pStyle w:val="25"/>
+            </w:pPr>
+            <w:r>
+              <w:rPr>
+                <w:rFonts w:hint="eastAsia"/>
+              </w:rPr>
+              <w:t>参考远程星智</w:t>
+            </w:r>
+            <w:r>
+              <w:t>H7E</w:t>
+            </w:r>
+            <w:r>
+              <w:rPr>
+                <w:rFonts w:hint="eastAsia"/>
+              </w:rPr>
+              <w:t>整车重量</w:t>
+            </w:r>
+            <w:r>
+              <w:t>2.95</w:t>
+            </w:r>
+            <w:r>
+              <w:rPr>
+                <w:rFonts w:hint="eastAsia"/>
+              </w:rPr>
+              <w:t>吨</w:t>
+            </w:r>
+          </w:p>
+        </w:tc>
+      </w:tr>
+      <w:tr>
+        <w:tblPrEx>
+          <w:tblCellMar>
+            <w:top w:w="0" w:type="dxa"/>
+            <w:left w:w="108" w:type="dxa"/>
+            <w:bottom w:w="0" w:type="dxa"/>
+            <w:right w:w="108" w:type="dxa"/>
+          </w:tblCellMar>
+        </w:tblPrEx>
+        <w:tc>
+          <w:p>
+            <w:pPr>
+              <w:pStyle w:val="25"/>
+            </w:pPr>
+            <w:r>
+              <w:rPr>
+                <w:rFonts w:hint="eastAsia"/>
+              </w:rPr>
+              <w:t>额定载质量</w:t>
+            </w:r>
+          </w:p>
+        </w:tc>
+        <w:tc>
+          <w:p>
+            <w:pPr>
+              <w:pStyle w:val="25"/>
+            </w:pPr>
+            <w:r>
+              <w:t>1</w:t>
+            </w:r>
+            <w:r>
+              <w:rPr>
+                <w:rFonts w:hint="eastAsia"/>
+                <w:lang w:val="en-US" w:eastAsia="zh-CN"/>
+              </w:rPr>
+              <w:t>400</w:t>
+            </w:r>
+            <w:r>
+              <w:t>kg</w:t>
+            </w:r>
+          </w:p>
+        </w:tc>
+        <w:tc>
+          <w:p>
+            <w:pPr>
+              <w:pStyle w:val="25"/>
+            </w:pPr>
+            <w:r>
+              <w:rPr>
+                <w:rFonts w:hint="eastAsia"/>
+              </w:rPr>
+              <w:t>由</w:t>
+            </w:r>
+            <w:r>
+              <w:t>4495kg</w:t>
+            </w:r>
+            <w:r>
+              <w:rPr>
+                <w:rFonts w:hint="eastAsia"/>
+              </w:rPr>
+              <w:t>总质量减去约</w:t>
             </w:r>
             <w:r>
               <w:t>3000kg</w:t>
             </w:r>
+            <w:r>
+              <w:rPr>
+                <w:rFonts w:hint="eastAsia"/>
+              </w:rPr>
+              <w:t>整备质量</w:t>
+            </w:r>
+          </w:p>
+        </w:tc>
+      </w:tr>
+      <w:tr>
+        <w:tblPrEx>
+          <w:tblCellMar>
+            <w:top w:w="0" w:type="dxa"/>
+            <w:left w:w="108" w:type="dxa"/>
+            <w:bottom w:w="0" w:type="dxa"/>
+            <w:right w:w="108" w:type="dxa"/>
+          </w:tblCellMar>
+        </w:tblPrEx>
+        <w:tc>
+          <w:p>
+            <w:pPr>
+              <w:pStyle w:val="25"/>
+            </w:pPr>
+            <w:r>
+              <w:rPr>
+                <w:rFonts w:hint="eastAsia"/>
+              </w:rPr>
+              <w:t>轴距</w:t>
+            </w:r>
+          </w:p>
+        </w:tc>
+        <w:tc>
+          <w:p>
+            <w:pPr>
+              <w:pStyle w:val="25"/>
+              <w:rPr>
+                <w:rFonts w:hint="default" w:eastAsia="宋体"/>
+                <w:lang w:val="en-US" w:eastAsia="zh-CN"/>
+              </w:rPr>
+            </w:pPr>
+            <w:r>
+              <w:t>3360mm</w:t>
+            </w:r>
+          </w:p>
+        </w:tc>
+        <w:tc>
+          <w:p>
+            <w:pPr>
+              <w:pStyle w:val="25"/>
+            </w:pPr>
+            <w:r>
+              <w:rPr>
+                <w:rFonts w:hint="eastAsia"/>
+              </w:rPr>
+              <w:t>比亚迪T5EV、福田智蓝EL-Plus、远程星智</w:t>
+            </w:r>
+            <w:r>
+              <w:t>H8E</w:t>
+            </w:r>
+            <w:r>
+              <w:rPr>
+                <w:rFonts w:hint="eastAsia"/>
+              </w:rPr>
+              <w:t>均采用</w:t>
+            </w:r>
+            <w:r>
+              <w:t>3360mm</w:t>
+            </w:r>
+            <w:r>
+              <w:rPr>
+                <w:rFonts w:hint="eastAsia"/>
+              </w:rPr>
+              <w:t>轴距</w:t>
+            </w:r>
+          </w:p>
+        </w:tc>
+      </w:tr>
+      <w:tr>
+        <w:tblPrEx>
+          <w:tblCellMar>
+            <w:top w:w="0" w:type="dxa"/>
+            <w:left w:w="108" w:type="dxa"/>
+            <w:bottom w:w="0" w:type="dxa"/>
+            <w:right w:w="108" w:type="dxa"/>
+          </w:tblCellMar>
+        </w:tblPrEx>
+        <w:tc>
+          <w:p>
+            <w:pPr>
+              <w:pStyle w:val="25"/>
+            </w:pPr>
+            <w:r>
+              <w:rPr>
+                <w:rFonts w:hint="eastAsia"/>
+              </w:rPr>
+              <w:t>车长</w:t>
+            </w:r>
+          </w:p>
+        </w:tc>
+        <w:tc>
+          <w:p>
+            <w:pPr>
+              <w:pStyle w:val="25"/>
+            </w:pPr>
+            <w:r>
+              <w:t>5995mm</w:t>
+            </w:r>
+          </w:p>
+        </w:tc>
+        <w:tc>
+          <w:p>
+            <w:pPr>
+              <w:pStyle w:val="25"/>
+            </w:pPr>
+            <w:r>
+              <w:rPr>
+                <w:rFonts w:hint="eastAsia"/>
+              </w:rPr>
+              <w:t>比亚迪T5EV、福田智蓝</w:t>
+            </w:r>
+            <w:r>
+              <w:t>EL-Plus</w:t>
+            </w:r>
+            <w:r>
+              <w:rPr>
+                <w:rFonts w:hint="eastAsia"/>
+              </w:rPr>
+              <w:t>参数中车长均为</w:t>
+            </w:r>
+            <w:r>
+              <w:t>5.995m</w:t>
+            </w:r>
+          </w:p>
+        </w:tc>
+      </w:tr>
+      <w:tr>
+        <w:tblPrEx>
+          <w:tblCellMar>
+            <w:top w:w="0" w:type="dxa"/>
+            <w:left w:w="108" w:type="dxa"/>
+            <w:bottom w:w="0" w:type="dxa"/>
+            <w:right w:w="108" w:type="dxa"/>
+          </w:tblCellMar>
+        </w:tblPrEx>
+        <w:tc>
+          <w:p>
+            <w:pPr>
+              <w:pStyle w:val="25"/>
+            </w:pPr>
+            <w:r>
+              <w:rPr>
+                <w:rFonts w:hint="eastAsia"/>
+              </w:rPr>
+              <w:t>车宽</w:t>
+            </w:r>
+          </w:p>
+        </w:tc>
+        <w:tc>
+          <w:p>
+            <w:pPr>
+              <w:pStyle w:val="25"/>
+            </w:pPr>
+            <w:r>
+              <w:t>21</w:t>
+            </w:r>
+            <w:r>
+              <w:rPr>
+                <w:rFonts w:hint="eastAsia"/>
+                <w:lang w:val="en-US" w:eastAsia="zh-CN"/>
+              </w:rPr>
+              <w:t>9</w:t>
+            </w:r>
+            <w:r>
+              <w:t>0mm</w:t>
+            </w:r>
+            <w:r>
+              <w:rPr>
+                <w:rFonts w:hint="eastAsia"/>
+              </w:rPr>
+              <w:t>左右</w:t>
+            </w:r>
+          </w:p>
+        </w:tc>
+        <w:tc>
+          <w:p>
+            <w:pPr>
+              <w:pStyle w:val="25"/>
+            </w:pPr>
+            <w:r>
+              <w:rPr>
+                <w:rFonts w:hint="eastAsia"/>
+              </w:rPr>
+              <w:t>参考福田智蓝</w:t>
+            </w:r>
+            <w:r>
+              <w:t>EL-Plus</w:t>
+            </w:r>
+            <w:r>
+              <w:rPr>
+                <w:rFonts w:hint="eastAsia"/>
+              </w:rPr>
+              <w:t>车宽</w:t>
+            </w:r>
+            <w:r>
+              <w:t>2.18m</w:t>
+            </w:r>
+          </w:p>
+        </w:tc>
+      </w:tr>
+      <w:tr>
+        <w:tblPrEx>
+          <w:tblCellMar>
+            <w:top w:w="0" w:type="dxa"/>
+            <w:left w:w="108" w:type="dxa"/>
+            <w:bottom w:w="0" w:type="dxa"/>
+            <w:right w:w="108" w:type="dxa"/>
+          </w:tblCellMar>
+        </w:tblPrEx>
+        <w:tc>
+          <w:p>
+            <w:pPr>
+              <w:pStyle w:val="25"/>
+            </w:pPr>
+            <w:r>
+              <w:rPr>
+                <w:rFonts w:hint="eastAsia"/>
+              </w:rPr>
+              <w:t>车高</w:t>
+            </w:r>
+          </w:p>
+        </w:tc>
+        <w:tc>
+          <w:p>
+            <w:pPr>
+              <w:pStyle w:val="25"/>
+            </w:pPr>
+            <w:r>
+              <w:t>31</w:t>
+            </w:r>
+            <w:r>
+              <w:rPr>
+                <w:rFonts w:hint="eastAsia"/>
+                <w:lang w:val="en-US" w:eastAsia="zh-CN"/>
+              </w:rPr>
+              <w:t>4</w:t>
+            </w:r>
+            <w:r>
+              <w:t>0mm</w:t>
+            </w:r>
+          </w:p>
+        </w:tc>
+        <w:tc>
+          <w:p>
+            <w:pPr>
+              <w:pStyle w:val="25"/>
+            </w:pPr>
+            <w:r>
+              <w:rPr>
+                <w:rFonts w:hint="eastAsia"/>
+              </w:rPr>
+              <w:t>参考福田智蓝</w:t>
+            </w:r>
+            <w:r>
+              <w:t>EL-Plus</w:t>
+            </w:r>
+            <w:r>
+              <w:rPr>
+                <w:rFonts w:hint="eastAsia"/>
+              </w:rPr>
+              <w:t>车高</w:t>
+            </w:r>
+            <w:r>
+              <w:t>3.1m</w:t>
+            </w:r>
+          </w:p>
+        </w:tc>
+      </w:tr>
+      <w:tr>
+        <w:tblPrEx>
+          <w:tblCellMar>
+            <w:top w:w="0" w:type="dxa"/>
+            <w:left w:w="108" w:type="dxa"/>
+            <w:bottom w:w="0" w:type="dxa"/>
+            <w:right w:w="108" w:type="dxa"/>
+          </w:tblCellMar>
+        </w:tblPrEx>
+        <w:tc>
+          <w:p>
+            <w:pPr>
+              <w:pStyle w:val="25"/>
+            </w:pPr>
+            <w:r>
+              <w:rPr>
+                <w:rFonts w:hint="eastAsia"/>
+              </w:rPr>
+              <w:t>货箱长度</w:t>
+            </w:r>
+          </w:p>
+        </w:tc>
+        <w:tc>
+          <w:p>
+            <w:pPr>
+              <w:pStyle w:val="25"/>
+            </w:pPr>
+            <w:r>
+              <w:t>4150mm</w:t>
+            </w:r>
+          </w:p>
+        </w:tc>
+        <w:tc>
+          <w:p>
+            <w:pPr>
+              <w:pStyle w:val="25"/>
+            </w:pPr>
+            <w:r>
+              <w:rPr>
+                <w:rFonts w:hint="eastAsia"/>
+              </w:rPr>
+              <w:t>参考福田</w:t>
+            </w:r>
+            <w:r>
+              <w:t>4.14</w:t>
+            </w:r>
+            <w:r>
+              <w:rPr>
+                <w:rFonts w:hint="eastAsia"/>
+              </w:rPr>
+              <w:t>m、远程</w:t>
+            </w:r>
+            <w:r>
+              <w:t>4.15</w:t>
+            </w:r>
+            <w:r>
+              <w:rPr>
+                <w:rFonts w:hint="eastAsia"/>
+              </w:rPr>
+              <w:t>m、比亚迪</w:t>
+            </w:r>
+            <w:r>
+              <w:t>4.2m</w:t>
+            </w:r>
+            <w:r>
+              <w:rPr>
+                <w:rFonts w:hint="eastAsia"/>
+              </w:rPr>
+              <w:t>货箱</w:t>
+            </w:r>
+          </w:p>
+        </w:tc>
+      </w:tr>
+      <w:tr>
+        <w:tblPrEx>
+          <w:tblCellMar>
+            <w:top w:w="0" w:type="dxa"/>
+            <w:left w:w="108" w:type="dxa"/>
+            <w:bottom w:w="0" w:type="dxa"/>
+            <w:right w:w="108" w:type="dxa"/>
+          </w:tblCellMar>
+        </w:tblPrEx>
+        <w:tc>
+          <w:p>
+            <w:pPr>
+              <w:pStyle w:val="25"/>
+            </w:pPr>
+            <w:r>
+              <w:rPr>
+                <w:rFonts w:hint="eastAsia"/>
+              </w:rPr>
+              <w:t>准乘人数</w:t>
+            </w:r>
+          </w:p>
+        </w:tc>
+        <w:tc>
+          <w:p>
+            <w:pPr>
+              <w:pStyle w:val="25"/>
+            </w:pPr>
+            <w:r>
+              <w:t>2</w:t>
+            </w:r>
+            <w:r>
+              <w:rPr>
+                <w:rFonts w:hint="eastAsia"/>
+              </w:rPr>
+              <w:t>人</w:t>
+            </w:r>
           </w:p>
         </w:tc>
         <w:tc>
@@ -6339,593 +6608,8 @@
               <w:rPr>
                 <w:rFonts w:hint="eastAsia"/>
               </w:rPr>
-              <w:t>整车重量</w:t>
-            </w:r>
-            <w:r>
-              <w:t>2.95</w:t>
-            </w:r>
-            <w:r>
-              <w:rPr>
-                <w:rFonts w:hint="eastAsia"/>
-              </w:rPr>
-              <w:t>吨</w:t>
-            </w:r>
-            <w:r>
-              <w:t>(</w:t>
-            </w:r>
-            <w:r>
-              <w:fldChar w:fldCharType="begin"/>
-            </w:r>
-            <w:r>
-              <w:instrText xml:space="preserve"> HYPERLINK "https://www.pixoville.com/www/product/truck/203517.html?utm_source=chatgpt.com" \h </w:instrText>
-            </w:r>
-            <w:r>
-              <w:fldChar w:fldCharType="separate"/>
-            </w:r>
-            <w:r>
-              <w:rPr>
-                <w:rStyle w:val="21"/>
-              </w:rPr>
-              <w:t>pixoville.com</w:t>
-            </w:r>
-            <w:r>
-              <w:rPr>
-                <w:rStyle w:val="21"/>
-              </w:rPr>
-              <w:fldChar w:fldCharType="end"/>
-            </w:r>
-            <w:r>
-              <w:t>)</w:t>
-            </w:r>
-          </w:p>
-        </w:tc>
-      </w:tr>
-      <w:tr>
-        <w:tblPrEx>
-          <w:tblCellMar>
-            <w:top w:w="0" w:type="dxa"/>
-            <w:left w:w="108" w:type="dxa"/>
-            <w:bottom w:w="0" w:type="dxa"/>
-            <w:right w:w="108" w:type="dxa"/>
-          </w:tblCellMar>
-        </w:tblPrEx>
-        <w:tc>
-          <w:p>
-            <w:pPr>
-              <w:pStyle w:val="25"/>
-            </w:pPr>
-            <w:r>
-              <w:rPr>
-                <w:rFonts w:hint="eastAsia"/>
-              </w:rPr>
-              <w:t>额定载质量</w:t>
-            </w:r>
-          </w:p>
-        </w:tc>
-        <w:tc>
-          <w:p>
-            <w:pPr>
-              <w:pStyle w:val="25"/>
-            </w:pPr>
-            <w:r>
-              <w:rPr>
-                <w:rFonts w:hint="eastAsia"/>
-              </w:rPr>
-              <w:t>约</w:t>
-            </w:r>
-            <w:r>
-              <w:t>1450kg</w:t>
-            </w:r>
-          </w:p>
-        </w:tc>
-        <w:tc>
-          <w:p>
-            <w:pPr>
-              <w:pStyle w:val="25"/>
-            </w:pPr>
-            <w:r>
-              <w:rPr>
-                <w:rFonts w:hint="eastAsia"/>
-              </w:rPr>
-              <w:t>由</w:t>
-            </w:r>
-            <w:r>
-              <w:t>4495kg</w:t>
-            </w:r>
-            <w:r>
-              <w:rPr>
-                <w:rFonts w:hint="eastAsia"/>
-              </w:rPr>
-              <w:t>总质量减去约</w:t>
-            </w:r>
-            <w:r>
-              <w:t>3000kg</w:t>
-            </w:r>
-            <w:r>
-              <w:rPr>
-                <w:rFonts w:hint="eastAsia"/>
-              </w:rPr>
-              <w:t>整备质量估算</w:t>
-            </w:r>
-          </w:p>
-        </w:tc>
-      </w:tr>
-      <w:tr>
-        <w:tblPrEx>
-          <w:tblCellMar>
-            <w:top w:w="0" w:type="dxa"/>
-            <w:left w:w="108" w:type="dxa"/>
-            <w:bottom w:w="0" w:type="dxa"/>
-            <w:right w:w="108" w:type="dxa"/>
-          </w:tblCellMar>
-        </w:tblPrEx>
-        <w:tc>
-          <w:p>
-            <w:pPr>
-              <w:pStyle w:val="25"/>
-            </w:pPr>
-            <w:r>
-              <w:rPr>
-                <w:rFonts w:hint="eastAsia"/>
-              </w:rPr>
-              <w:t>轴距</w:t>
-            </w:r>
-          </w:p>
-        </w:tc>
-        <w:tc>
-          <w:p>
-            <w:pPr>
-              <w:pStyle w:val="25"/>
-            </w:pPr>
-            <w:r>
-              <w:t>3360mm</w:t>
-            </w:r>
-          </w:p>
-        </w:tc>
-        <w:tc>
-          <w:p>
-            <w:pPr>
-              <w:pStyle w:val="25"/>
-            </w:pPr>
-            <w:r>
-              <w:rPr>
-                <w:rFonts w:hint="eastAsia"/>
-              </w:rPr>
-              <w:t>比亚迪T5EV、福田智蓝EL-Plus、远程星智</w:t>
-            </w:r>
-            <w:r>
-              <w:t>H8E</w:t>
-            </w:r>
-            <w:r>
-              <w:rPr>
-                <w:rFonts w:hint="eastAsia"/>
-              </w:rPr>
-              <w:t>均采用</w:t>
-            </w:r>
-            <w:r>
-              <w:t>3360mm</w:t>
-            </w:r>
-            <w:r>
-              <w:rPr>
-                <w:rFonts w:hint="eastAsia"/>
-              </w:rPr>
-              <w:t>轴距</w:t>
-            </w:r>
-            <w:r>
-              <w:t>(</w:t>
-            </w:r>
-            <w:r>
-              <w:fldChar w:fldCharType="begin"/>
-            </w:r>
-            <w:r>
-              <w:instrText xml:space="preserve"> HYPERLINK "https://product.360che.com/m805/201414_index.html?utm_source=chatgpt.com" \h </w:instrText>
-            </w:r>
-            <w:r>
-              <w:fldChar w:fldCharType="separate"/>
-            </w:r>
-            <w:r>
-              <w:rPr>
-                <w:rStyle w:val="21"/>
-              </w:rPr>
-              <w:t>product.360che.com</w:t>
-            </w:r>
-            <w:r>
-              <w:rPr>
-                <w:rStyle w:val="21"/>
-              </w:rPr>
-              <w:fldChar w:fldCharType="end"/>
-            </w:r>
-            <w:r>
-              <w:t>)</w:t>
-            </w:r>
-          </w:p>
-        </w:tc>
-      </w:tr>
-      <w:tr>
-        <w:tblPrEx>
-          <w:tblCellMar>
-            <w:top w:w="0" w:type="dxa"/>
-            <w:left w:w="108" w:type="dxa"/>
-            <w:bottom w:w="0" w:type="dxa"/>
-            <w:right w:w="108" w:type="dxa"/>
-          </w:tblCellMar>
-        </w:tblPrEx>
-        <w:tc>
-          <w:p>
-            <w:pPr>
-              <w:pStyle w:val="25"/>
-            </w:pPr>
-            <w:r>
-              <w:rPr>
-                <w:rFonts w:hint="eastAsia"/>
-              </w:rPr>
-              <w:t>车长</w:t>
-            </w:r>
-          </w:p>
-        </w:tc>
-        <w:tc>
-          <w:p>
-            <w:pPr>
-              <w:pStyle w:val="25"/>
-            </w:pPr>
-            <w:r>
-              <w:t>5995mm</w:t>
-            </w:r>
-          </w:p>
-        </w:tc>
-        <w:tc>
-          <w:p>
-            <w:pPr>
-              <w:pStyle w:val="25"/>
-            </w:pPr>
-            <w:r>
-              <w:rPr>
-                <w:rFonts w:hint="eastAsia"/>
-              </w:rPr>
-              <w:t>比亚迪T5EV、福田智蓝</w:t>
-            </w:r>
-            <w:r>
-              <w:t>EL-Plus</w:t>
-            </w:r>
-            <w:r>
-              <w:rPr>
-                <w:rFonts w:hint="eastAsia"/>
-              </w:rPr>
-              <w:t>参数中车长均为</w:t>
-            </w:r>
-            <w:r>
-              <w:t>5.995m(</w:t>
-            </w:r>
-            <w:r>
-              <w:fldChar w:fldCharType="begin"/>
-            </w:r>
-            <w:r>
-              <w:instrText xml:space="preserve"> HYPERLINK "https://product.360che.com/m805/201411_param.html?utm_source=chatgpt.com" \h </w:instrText>
-            </w:r>
-            <w:r>
-              <w:fldChar w:fldCharType="separate"/>
-            </w:r>
-            <w:r>
-              <w:rPr>
-                <w:rStyle w:val="21"/>
-              </w:rPr>
-              <w:t>product.360che.com</w:t>
-            </w:r>
-            <w:r>
-              <w:rPr>
-                <w:rStyle w:val="21"/>
-              </w:rPr>
-              <w:fldChar w:fldCharType="end"/>
-            </w:r>
-            <w:r>
-              <w:t>)</w:t>
-            </w:r>
-          </w:p>
-        </w:tc>
-      </w:tr>
-      <w:tr>
-        <w:tblPrEx>
-          <w:tblCellMar>
-            <w:top w:w="0" w:type="dxa"/>
-            <w:left w:w="108" w:type="dxa"/>
-            <w:bottom w:w="0" w:type="dxa"/>
-            <w:right w:w="108" w:type="dxa"/>
-          </w:tblCellMar>
-        </w:tblPrEx>
-        <w:tc>
-          <w:p>
-            <w:pPr>
-              <w:pStyle w:val="25"/>
-            </w:pPr>
-            <w:r>
-              <w:rPr>
-                <w:rFonts w:hint="eastAsia"/>
-              </w:rPr>
-              <w:t>车宽</w:t>
-            </w:r>
-          </w:p>
-        </w:tc>
-        <w:tc>
-          <w:p>
-            <w:pPr>
-              <w:pStyle w:val="25"/>
-            </w:pPr>
-            <w:r>
-              <w:t>2180mm</w:t>
-            </w:r>
-            <w:r>
-              <w:rPr>
-                <w:rFonts w:hint="eastAsia"/>
-              </w:rPr>
-              <w:t>左右</w:t>
-            </w:r>
-          </w:p>
-        </w:tc>
-        <w:tc>
-          <w:p>
-            <w:pPr>
-              <w:pStyle w:val="25"/>
-            </w:pPr>
-            <w:r>
-              <w:rPr>
-                <w:rFonts w:hint="eastAsia"/>
-              </w:rPr>
-              <w:t>参考福田智蓝</w:t>
-            </w:r>
-            <w:r>
-              <w:t>EL-Plus</w:t>
-            </w:r>
-            <w:r>
-              <w:rPr>
-                <w:rFonts w:hint="eastAsia"/>
-              </w:rPr>
-              <w:t>车宽</w:t>
-            </w:r>
-            <w:r>
-              <w:t>2.18m(</w:t>
-            </w:r>
-            <w:r>
-              <w:fldChar w:fldCharType="begin"/>
-            </w:r>
-            <w:r>
-              <w:instrText xml:space="preserve"> HYPERLINK "https://product.360che.com/m788/197103_param.html?utm_source=chatgpt.com" \h </w:instrText>
-            </w:r>
-            <w:r>
-              <w:fldChar w:fldCharType="separate"/>
-            </w:r>
-            <w:r>
-              <w:rPr>
-                <w:rStyle w:val="21"/>
-              </w:rPr>
-              <w:t>product.360che.com</w:t>
-            </w:r>
-            <w:r>
-              <w:rPr>
-                <w:rStyle w:val="21"/>
-              </w:rPr>
-              <w:fldChar w:fldCharType="end"/>
-            </w:r>
-            <w:r>
-              <w:t>)</w:t>
-            </w:r>
-          </w:p>
-        </w:tc>
-      </w:tr>
-      <w:tr>
-        <w:tblPrEx>
-          <w:tblCellMar>
-            <w:top w:w="0" w:type="dxa"/>
-            <w:left w:w="108" w:type="dxa"/>
-            <w:bottom w:w="0" w:type="dxa"/>
-            <w:right w:w="108" w:type="dxa"/>
-          </w:tblCellMar>
-        </w:tblPrEx>
-        <w:tc>
-          <w:p>
-            <w:pPr>
-              <w:pStyle w:val="25"/>
-            </w:pPr>
-            <w:r>
-              <w:rPr>
-                <w:rFonts w:hint="eastAsia"/>
-              </w:rPr>
-              <w:t>车高</w:t>
-            </w:r>
-          </w:p>
-        </w:tc>
-        <w:tc>
-          <w:p>
-            <w:pPr>
-              <w:pStyle w:val="25"/>
-            </w:pPr>
-            <w:r>
-              <w:t>3100mm</w:t>
-            </w:r>
-            <w:r>
-              <w:rPr>
-                <w:rFonts w:hint="eastAsia"/>
-              </w:rPr>
-              <w:t>左右</w:t>
-            </w:r>
-          </w:p>
-        </w:tc>
-        <w:tc>
-          <w:p>
-            <w:pPr>
-              <w:pStyle w:val="25"/>
-            </w:pPr>
-            <w:r>
-              <w:rPr>
-                <w:rFonts w:hint="eastAsia"/>
-              </w:rPr>
-              <w:t>参考福田智蓝</w:t>
-            </w:r>
-            <w:r>
-              <w:t>EL-Plus</w:t>
-            </w:r>
-            <w:r>
-              <w:rPr>
-                <w:rFonts w:hint="eastAsia"/>
-              </w:rPr>
-              <w:t>车高</w:t>
-            </w:r>
-            <w:r>
-              <w:t>3.1m(</w:t>
-            </w:r>
-            <w:r>
-              <w:fldChar w:fldCharType="begin"/>
-            </w:r>
-            <w:r>
-              <w:instrText xml:space="preserve"> HYPERLINK "https://product.360che.com/m788/197103_param.html?utm_source=chatgpt.com" \h </w:instrText>
-            </w:r>
-            <w:r>
-              <w:fldChar w:fldCharType="separate"/>
-            </w:r>
-            <w:r>
-              <w:rPr>
-                <w:rStyle w:val="21"/>
-              </w:rPr>
-              <w:t>product.360che.com</w:t>
-            </w:r>
-            <w:r>
-              <w:rPr>
-                <w:rStyle w:val="21"/>
-              </w:rPr>
-              <w:fldChar w:fldCharType="end"/>
-            </w:r>
-            <w:r>
-              <w:t>)</w:t>
-            </w:r>
-          </w:p>
-        </w:tc>
-      </w:tr>
-      <w:tr>
-        <w:tblPrEx>
-          <w:tblCellMar>
-            <w:top w:w="0" w:type="dxa"/>
-            <w:left w:w="108" w:type="dxa"/>
-            <w:bottom w:w="0" w:type="dxa"/>
-            <w:right w:w="108" w:type="dxa"/>
-          </w:tblCellMar>
-        </w:tblPrEx>
-        <w:tc>
-          <w:p>
-            <w:pPr>
-              <w:pStyle w:val="25"/>
-            </w:pPr>
-            <w:r>
-              <w:rPr>
-                <w:rFonts w:hint="eastAsia"/>
-              </w:rPr>
-              <w:t>货箱长度</w:t>
-            </w:r>
-          </w:p>
-        </w:tc>
-        <w:tc>
-          <w:p>
-            <w:pPr>
-              <w:pStyle w:val="25"/>
-            </w:pPr>
-            <w:r>
-              <w:t>4150mm</w:t>
-            </w:r>
-          </w:p>
-        </w:tc>
-        <w:tc>
-          <w:p>
-            <w:pPr>
-              <w:pStyle w:val="25"/>
-            </w:pPr>
-            <w:r>
-              <w:rPr>
-                <w:rFonts w:hint="eastAsia"/>
-              </w:rPr>
-              <w:t>参考福田</w:t>
-            </w:r>
-            <w:r>
-              <w:t>4.14</w:t>
-            </w:r>
-            <w:r>
-              <w:rPr>
-                <w:rFonts w:hint="eastAsia"/>
-              </w:rPr>
-              <w:t>m、远程</w:t>
-            </w:r>
-            <w:r>
-              <w:t>4.15</w:t>
-            </w:r>
-            <w:r>
-              <w:rPr>
-                <w:rFonts w:hint="eastAsia"/>
-              </w:rPr>
-              <w:t>m、比亚迪</w:t>
-            </w:r>
-            <w:r>
-              <w:t>4.2m</w:t>
-            </w:r>
-            <w:r>
-              <w:rPr>
-                <w:rFonts w:hint="eastAsia"/>
-              </w:rPr>
-              <w:t>货箱</w:t>
-            </w:r>
-            <w:r>
-              <w:t>(</w:t>
-            </w:r>
-            <w:r>
-              <w:fldChar w:fldCharType="begin"/>
-            </w:r>
-            <w:r>
-              <w:instrText xml:space="preserve"> HYPERLINK "https://product.360che.com/m805/201414_index.html?utm_source=chatgpt.com" \h </w:instrText>
-            </w:r>
-            <w:r>
-              <w:fldChar w:fldCharType="separate"/>
-            </w:r>
-            <w:r>
-              <w:rPr>
-                <w:rStyle w:val="21"/>
-              </w:rPr>
-              <w:t>product.360che.com</w:t>
-            </w:r>
-            <w:r>
-              <w:rPr>
-                <w:rStyle w:val="21"/>
-              </w:rPr>
-              <w:fldChar w:fldCharType="end"/>
-            </w:r>
-            <w:r>
-              <w:t>)</w:t>
-            </w:r>
-          </w:p>
-        </w:tc>
-      </w:tr>
-      <w:tr>
-        <w:tblPrEx>
-          <w:tblCellMar>
-            <w:top w:w="0" w:type="dxa"/>
-            <w:left w:w="108" w:type="dxa"/>
-            <w:bottom w:w="0" w:type="dxa"/>
-            <w:right w:w="108" w:type="dxa"/>
-          </w:tblCellMar>
-        </w:tblPrEx>
-        <w:tc>
-          <w:p>
-            <w:pPr>
-              <w:pStyle w:val="25"/>
-            </w:pPr>
-            <w:r>
-              <w:rPr>
-                <w:rFonts w:hint="eastAsia"/>
-              </w:rPr>
-              <w:t>准乘人数</w:t>
-            </w:r>
-          </w:p>
-        </w:tc>
-        <w:tc>
-          <w:p>
-            <w:pPr>
-              <w:pStyle w:val="25"/>
-            </w:pPr>
+              <w:t>单排驾驶室准乘</w:t>
+            </w:r>
             <w:r>
               <w:t>2</w:t>
             </w:r>
@@ -6934,64 +6618,6 @@
                 <w:rFonts w:hint="eastAsia"/>
               </w:rPr>
               <w:t>人</w:t>
-            </w:r>
-          </w:p>
-        </w:tc>
-        <w:tc>
-          <w:p>
-            <w:pPr>
-              <w:pStyle w:val="25"/>
-            </w:pPr>
-            <w:r>
-              <w:rPr>
-                <w:rFonts w:hint="eastAsia"/>
-              </w:rPr>
-              <w:t>参考远程星智</w:t>
-            </w:r>
-            <w:r>
-              <w:t>H7E</w:t>
-            </w:r>
-            <w:r>
-              <w:rPr>
-                <w:rFonts w:hint="eastAsia"/>
-              </w:rPr>
-              <w:t>单排驾驶室准乘</w:t>
-            </w:r>
-            <w:r>
-              <w:t>2</w:t>
-            </w:r>
-            <w:r>
-              <w:rPr>
-                <w:rFonts w:hint="eastAsia"/>
-              </w:rPr>
-              <w:t>人</w:t>
-            </w:r>
-            <w:r>
-              <w:t>(</w:t>
-            </w:r>
-            <w:r>
-              <w:fldChar w:fldCharType="begin"/>
-            </w:r>
-            <w:r>
-              <w:instrText xml:space="preserve"> HYPERLINK "https://www.pixoville.com/www/product/truck/203517.html?utm_source=chatgpt.com" \h </w:instrText>
-            </w:r>
-            <w:r>
-              <w:fldChar w:fldCharType="separate"/>
-            </w:r>
-            <w:r>
-              <w:rPr>
-                <w:rStyle w:val="21"/>
-              </w:rPr>
-              <w:t>pixoville.com</w:t>
-            </w:r>
-            <w:r>
-              <w:rPr>
-                <w:rStyle w:val="21"/>
-              </w:rPr>
-              <w:fldChar w:fldCharType="end"/>
-            </w:r>
-            <w:r>
-              <w:t>)</w:t>
             </w:r>
           </w:p>
         </w:tc>
@@ -7216,6 +6842,9 @@
     <w:p>
       <w:pPr>
         <w:pStyle w:val="24"/>
+        <w:rPr>
+          <w:rFonts w:hint="eastAsia"/>
+        </w:rPr>
       </w:pPr>
       <w:r>
         <w:rPr>
@@ -7223,6 +6852,791 @@
         </w:rPr>
         <w:t>该方案结构简单、传动效率高、维护成本低，适合城市物流车辆频繁启停、低速大扭矩、路线相对固定的使用特点。</w:t>
       </w:r>
+    </w:p>
+    <w:p>
+      <w:pPr>
+        <w:pStyle w:val="4"/>
+        <w:bidi w:val="0"/>
+        <w:rPr>
+          <w:rFonts w:hint="eastAsia"/>
+          <w:lang w:val="en-US" w:eastAsia="zh-CN"/>
+        </w:rPr>
+      </w:pPr>
+      <w:r>
+        <w:rPr>
+          <w:rFonts w:hint="eastAsia"/>
+          <w:lang w:val="en-US" w:eastAsia="zh-CN"/>
+        </w:rPr>
+        <w:t>电池选型</w:t>
+      </w:r>
+    </w:p>
+    <w:tbl>
+      <w:tblPr>
+        <w:tblW w:w="6307" w:type="dxa"/>
+        <w:jc w:val="center"/>
+        <w:tblCellSpacing w:w="15" w:type="dxa"/>
+        <w:tblBorders>
+          <w:top w:val="none" w:color="auto" w:sz="0" w:space="0"/>
+          <w:left w:val="none" w:color="auto" w:sz="0" w:space="0"/>
+          <w:bottom w:val="none" w:color="auto" w:sz="0" w:space="0"/>
+          <w:right w:val="none" w:color="auto" w:sz="0" w:space="0"/>
+          <w:insideH w:val="none" w:color="auto" w:sz="0" w:space="0"/>
+          <w:insideV w:val="none" w:color="auto" w:sz="0" w:space="0"/>
+        </w:tblBorders>
+        <w:shd w:val="clear"/>
+        <w:tblLayout w:type="autofit"/>
+        <w:tblCellMar>
+          <w:top w:w="15" w:type="dxa"/>
+          <w:left w:w="15" w:type="dxa"/>
+          <w:bottom w:w="15" w:type="dxa"/>
+          <w:right w:w="15" w:type="dxa"/>
+        </w:tblCellMar>
+      </w:tblPr>
+      <w:tblGrid>
+        <w:gridCol w:w="1736"/>
+        <w:gridCol w:w="4571"/>
+      </w:tblGrid>
+      <w:tr>
+        <w:tblPrEx>
+          <w:tblBorders>
+            <w:top w:val="none" w:color="auto" w:sz="0" w:space="0"/>
+            <w:left w:val="none" w:color="auto" w:sz="0" w:space="0"/>
+            <w:bottom w:val="none" w:color="auto" w:sz="0" w:space="0"/>
+            <w:right w:val="none" w:color="auto" w:sz="0" w:space="0"/>
+            <w:insideH w:val="none" w:color="auto" w:sz="0" w:space="0"/>
+            <w:insideV w:val="none" w:color="auto" w:sz="0" w:space="0"/>
+          </w:tblBorders>
+          <w:tblCellMar>
+            <w:top w:w="15" w:type="dxa"/>
+            <w:left w:w="15" w:type="dxa"/>
+            <w:bottom w:w="15" w:type="dxa"/>
+            <w:right w:w="15" w:type="dxa"/>
+          </w:tblCellMar>
+        </w:tblPrEx>
+        <w:trPr>
+          <w:trHeight w:val="0" w:hRule="atLeast"/>
+          <w:tblHeader/>
+          <w:tblCellSpacing w:w="15" w:type="dxa"/>
+          <w:jc w:val="center"/>
+        </w:trPr>
+        <w:tc>
+          <w:tcPr>
+            <w:tcW w:w="1691" w:type="dxa"/>
+            <w:shd w:val="clear"/>
+            <w:vAlign w:val="center"/>
+          </w:tcPr>
+          <w:p>
+            <w:pPr>
+              <w:keepNext w:val="0"/>
+              <w:keepLines w:val="0"/>
+              <w:widowControl/>
+              <w:suppressLineNumbers w:val="0"/>
+              <w:snapToGrid w:val="0"/>
+              <w:ind w:left="0" w:leftChars="0" w:right="0" w:rightChars="0" w:firstLine="0" w:firstLineChars="0"/>
+              <w:jc w:val="center"/>
+              <w:rPr>
+                <w:b/>
+                <w:bCs/>
+              </w:rPr>
+            </w:pPr>
+            <w:r>
+              <w:rPr>
+                <w:rFonts w:ascii="宋体" w:hAnsi="宋体" w:eastAsia="宋体" w:cs="宋体"/>
+                <w:b/>
+                <w:bCs/>
+                <w:kern w:val="0"/>
+                <w:sz w:val="24"/>
+                <w:szCs w:val="24"/>
+                <w:lang w:val="en-US" w:eastAsia="zh-CN" w:bidi="ar"/>
+              </w:rPr>
+              <w:t>参数</w:t>
+            </w:r>
+          </w:p>
+        </w:tc>
+        <w:tc>
+          <w:tcPr>
+            <w:tcW w:w="4526" w:type="dxa"/>
+            <w:shd w:val="clear"/>
+            <w:vAlign w:val="center"/>
+          </w:tcPr>
+          <w:p>
+            <w:pPr>
+              <w:keepNext w:val="0"/>
+              <w:keepLines w:val="0"/>
+              <w:widowControl/>
+              <w:suppressLineNumbers w:val="0"/>
+              <w:snapToGrid w:val="0"/>
+              <w:ind w:left="0" w:leftChars="0" w:right="0" w:rightChars="0" w:firstLine="0" w:firstLineChars="0"/>
+              <w:jc w:val="center"/>
+              <w:rPr>
+                <w:b/>
+                <w:bCs/>
+              </w:rPr>
+            </w:pPr>
+            <w:r>
+              <w:rPr>
+                <w:rFonts w:ascii="宋体" w:hAnsi="宋体" w:eastAsia="宋体" w:cs="宋体"/>
+                <w:b/>
+                <w:bCs/>
+                <w:kern w:val="0"/>
+                <w:sz w:val="24"/>
+                <w:szCs w:val="24"/>
+                <w:lang w:val="en-US" w:eastAsia="zh-CN" w:bidi="ar"/>
+              </w:rPr>
+              <w:t>设计值</w:t>
+            </w:r>
+          </w:p>
+        </w:tc>
+      </w:tr>
+      <w:tr>
+        <w:tblPrEx>
+          <w:tblBorders>
+            <w:top w:val="none" w:color="auto" w:sz="0" w:space="0"/>
+            <w:left w:val="none" w:color="auto" w:sz="0" w:space="0"/>
+            <w:bottom w:val="none" w:color="auto" w:sz="0" w:space="0"/>
+            <w:right w:val="none" w:color="auto" w:sz="0" w:space="0"/>
+            <w:insideH w:val="none" w:color="auto" w:sz="0" w:space="0"/>
+            <w:insideV w:val="none" w:color="auto" w:sz="0" w:space="0"/>
+          </w:tblBorders>
+          <w:shd w:val="clear"/>
+          <w:tblCellMar>
+            <w:top w:w="15" w:type="dxa"/>
+            <w:left w:w="15" w:type="dxa"/>
+            <w:bottom w:w="15" w:type="dxa"/>
+            <w:right w:w="15" w:type="dxa"/>
+          </w:tblCellMar>
+        </w:tblPrEx>
+        <w:trPr>
+          <w:trHeight w:val="0" w:hRule="atLeast"/>
+          <w:tblCellSpacing w:w="15" w:type="dxa"/>
+          <w:jc w:val="center"/>
+        </w:trPr>
+        <w:tc>
+          <w:tcPr>
+            <w:tcW w:w="1691" w:type="dxa"/>
+            <w:shd w:val="clear"/>
+            <w:vAlign w:val="center"/>
+          </w:tcPr>
+          <w:p>
+            <w:pPr>
+              <w:keepNext w:val="0"/>
+              <w:keepLines w:val="0"/>
+              <w:widowControl/>
+              <w:suppressLineNumbers w:val="0"/>
+              <w:snapToGrid w:val="0"/>
+              <w:ind w:left="0" w:leftChars="0" w:right="0" w:rightChars="0" w:firstLine="0" w:firstLineChars="0"/>
+              <w:jc w:val="center"/>
+            </w:pPr>
+            <w:r>
+              <w:rPr>
+                <w:rFonts w:ascii="宋体" w:hAnsi="宋体" w:eastAsia="宋体" w:cs="宋体"/>
+                <w:kern w:val="0"/>
+                <w:sz w:val="24"/>
+                <w:szCs w:val="24"/>
+                <w:lang w:val="en-US" w:eastAsia="zh-CN" w:bidi="ar"/>
+              </w:rPr>
+              <w:t>电池类型</w:t>
+            </w:r>
+          </w:p>
+        </w:tc>
+        <w:tc>
+          <w:tcPr>
+            <w:tcW w:w="4526" w:type="dxa"/>
+            <w:shd w:val="clear"/>
+            <w:vAlign w:val="center"/>
+          </w:tcPr>
+          <w:p>
+            <w:pPr>
+              <w:keepNext w:val="0"/>
+              <w:keepLines w:val="0"/>
+              <w:widowControl/>
+              <w:suppressLineNumbers w:val="0"/>
+              <w:snapToGrid w:val="0"/>
+              <w:ind w:left="0" w:leftChars="0" w:right="0" w:rightChars="0" w:firstLine="0" w:firstLineChars="0"/>
+              <w:jc w:val="left"/>
+            </w:pPr>
+            <w:r>
+              <w:rPr>
+                <w:rFonts w:ascii="宋体" w:hAnsi="宋体" w:eastAsia="宋体" w:cs="宋体"/>
+                <w:kern w:val="0"/>
+                <w:sz w:val="24"/>
+                <w:szCs w:val="24"/>
+                <w:lang w:val="en-US" w:eastAsia="zh-CN" w:bidi="ar"/>
+              </w:rPr>
+              <w:t>磷酸铁锂动力电池</w:t>
+            </w:r>
+          </w:p>
+        </w:tc>
+      </w:tr>
+      <w:tr>
+        <w:tblPrEx>
+          <w:tblBorders>
+            <w:top w:val="none" w:color="auto" w:sz="0" w:space="0"/>
+            <w:left w:val="none" w:color="auto" w:sz="0" w:space="0"/>
+            <w:bottom w:val="none" w:color="auto" w:sz="0" w:space="0"/>
+            <w:right w:val="none" w:color="auto" w:sz="0" w:space="0"/>
+            <w:insideH w:val="none" w:color="auto" w:sz="0" w:space="0"/>
+            <w:insideV w:val="none" w:color="auto" w:sz="0" w:space="0"/>
+          </w:tblBorders>
+          <w:shd w:val="clear"/>
+          <w:tblCellMar>
+            <w:top w:w="15" w:type="dxa"/>
+            <w:left w:w="15" w:type="dxa"/>
+            <w:bottom w:w="15" w:type="dxa"/>
+            <w:right w:w="15" w:type="dxa"/>
+          </w:tblCellMar>
+        </w:tblPrEx>
+        <w:trPr>
+          <w:trHeight w:val="0" w:hRule="atLeast"/>
+          <w:tblCellSpacing w:w="15" w:type="dxa"/>
+          <w:jc w:val="center"/>
+        </w:trPr>
+        <w:tc>
+          <w:tcPr>
+            <w:tcW w:w="1691" w:type="dxa"/>
+            <w:shd w:val="clear"/>
+            <w:vAlign w:val="center"/>
+          </w:tcPr>
+          <w:p>
+            <w:pPr>
+              <w:keepNext w:val="0"/>
+              <w:keepLines w:val="0"/>
+              <w:widowControl/>
+              <w:suppressLineNumbers w:val="0"/>
+              <w:snapToGrid w:val="0"/>
+              <w:ind w:left="0" w:leftChars="0" w:right="0" w:rightChars="0" w:firstLine="0" w:firstLineChars="0"/>
+              <w:jc w:val="center"/>
+            </w:pPr>
+            <w:r>
+              <w:rPr>
+                <w:rFonts w:ascii="宋体" w:hAnsi="宋体" w:eastAsia="宋体" w:cs="宋体"/>
+                <w:kern w:val="0"/>
+                <w:sz w:val="24"/>
+                <w:szCs w:val="24"/>
+                <w:lang w:val="en-US" w:eastAsia="zh-CN" w:bidi="ar"/>
+              </w:rPr>
+              <w:t>电池容量</w:t>
+            </w:r>
+          </w:p>
+        </w:tc>
+        <w:tc>
+          <w:tcPr>
+            <w:tcW w:w="4526" w:type="dxa"/>
+            <w:shd w:val="clear"/>
+            <w:vAlign w:val="center"/>
+          </w:tcPr>
+          <w:p>
+            <w:pPr>
+              <w:keepNext w:val="0"/>
+              <w:keepLines w:val="0"/>
+              <w:widowControl/>
+              <w:suppressLineNumbers w:val="0"/>
+              <w:snapToGrid w:val="0"/>
+              <w:ind w:left="0" w:leftChars="0" w:right="0" w:rightChars="0" w:firstLine="0" w:firstLineChars="0"/>
+              <w:jc w:val="left"/>
+            </w:pPr>
+            <w:r>
+              <w:rPr>
+                <w:rFonts w:ascii="宋体" w:hAnsi="宋体" w:eastAsia="宋体" w:cs="宋体"/>
+                <w:kern w:val="0"/>
+                <w:sz w:val="24"/>
+                <w:szCs w:val="24"/>
+                <w:lang w:val="en-US" w:eastAsia="zh-CN" w:bidi="ar"/>
+              </w:rPr>
+              <w:t>100kWh</w:t>
+            </w:r>
+          </w:p>
+        </w:tc>
+      </w:tr>
+      <w:tr>
+        <w:tblPrEx>
+          <w:tblBorders>
+            <w:top w:val="none" w:color="auto" w:sz="0" w:space="0"/>
+            <w:left w:val="none" w:color="auto" w:sz="0" w:space="0"/>
+            <w:bottom w:val="none" w:color="auto" w:sz="0" w:space="0"/>
+            <w:right w:val="none" w:color="auto" w:sz="0" w:space="0"/>
+            <w:insideH w:val="none" w:color="auto" w:sz="0" w:space="0"/>
+            <w:insideV w:val="none" w:color="auto" w:sz="0" w:space="0"/>
+          </w:tblBorders>
+          <w:shd w:val="clear"/>
+          <w:tblCellMar>
+            <w:top w:w="15" w:type="dxa"/>
+            <w:left w:w="15" w:type="dxa"/>
+            <w:bottom w:w="15" w:type="dxa"/>
+            <w:right w:w="15" w:type="dxa"/>
+          </w:tblCellMar>
+        </w:tblPrEx>
+        <w:trPr>
+          <w:trHeight w:val="0" w:hRule="atLeast"/>
+          <w:tblCellSpacing w:w="15" w:type="dxa"/>
+          <w:jc w:val="center"/>
+        </w:trPr>
+        <w:tc>
+          <w:tcPr>
+            <w:tcW w:w="1691" w:type="dxa"/>
+            <w:shd w:val="clear"/>
+            <w:vAlign w:val="center"/>
+          </w:tcPr>
+          <w:p>
+            <w:pPr>
+              <w:keepNext w:val="0"/>
+              <w:keepLines w:val="0"/>
+              <w:widowControl/>
+              <w:suppressLineNumbers w:val="0"/>
+              <w:snapToGrid w:val="0"/>
+              <w:ind w:left="0" w:leftChars="0" w:right="0" w:rightChars="0" w:firstLine="0" w:firstLineChars="0"/>
+              <w:jc w:val="center"/>
+            </w:pPr>
+            <w:r>
+              <w:rPr>
+                <w:rFonts w:ascii="宋体" w:hAnsi="宋体" w:eastAsia="宋体" w:cs="宋体"/>
+                <w:kern w:val="0"/>
+                <w:sz w:val="24"/>
+                <w:szCs w:val="24"/>
+                <w:lang w:val="en-US" w:eastAsia="zh-CN" w:bidi="ar"/>
+              </w:rPr>
+              <w:t>标称电压</w:t>
+            </w:r>
+          </w:p>
+        </w:tc>
+        <w:tc>
+          <w:tcPr>
+            <w:tcW w:w="4526" w:type="dxa"/>
+            <w:shd w:val="clear"/>
+            <w:vAlign w:val="center"/>
+          </w:tcPr>
+          <w:p>
+            <w:pPr>
+              <w:keepNext w:val="0"/>
+              <w:keepLines w:val="0"/>
+              <w:widowControl/>
+              <w:suppressLineNumbers w:val="0"/>
+              <w:snapToGrid w:val="0"/>
+              <w:ind w:left="0" w:leftChars="0" w:right="0" w:rightChars="0" w:firstLine="0" w:firstLineChars="0"/>
+              <w:jc w:val="left"/>
+            </w:pPr>
+            <w:r>
+              <w:rPr>
+                <w:rFonts w:ascii="宋体" w:hAnsi="宋体" w:eastAsia="宋体" w:cs="宋体"/>
+                <w:kern w:val="0"/>
+                <w:sz w:val="24"/>
+                <w:szCs w:val="24"/>
+                <w:lang w:val="en-US" w:eastAsia="zh-CN" w:bidi="ar"/>
+              </w:rPr>
+              <w:t>540–600V</w:t>
+            </w:r>
+          </w:p>
+        </w:tc>
+      </w:tr>
+      <w:tr>
+        <w:tblPrEx>
+          <w:tblBorders>
+            <w:top w:val="none" w:color="auto" w:sz="0" w:space="0"/>
+            <w:left w:val="none" w:color="auto" w:sz="0" w:space="0"/>
+            <w:bottom w:val="none" w:color="auto" w:sz="0" w:space="0"/>
+            <w:right w:val="none" w:color="auto" w:sz="0" w:space="0"/>
+            <w:insideH w:val="none" w:color="auto" w:sz="0" w:space="0"/>
+            <w:insideV w:val="none" w:color="auto" w:sz="0" w:space="0"/>
+          </w:tblBorders>
+          <w:shd w:val="clear"/>
+          <w:tblCellMar>
+            <w:top w:w="15" w:type="dxa"/>
+            <w:left w:w="15" w:type="dxa"/>
+            <w:bottom w:w="15" w:type="dxa"/>
+            <w:right w:w="15" w:type="dxa"/>
+          </w:tblCellMar>
+        </w:tblPrEx>
+        <w:trPr>
+          <w:trHeight w:val="0" w:hRule="atLeast"/>
+          <w:tblCellSpacing w:w="15" w:type="dxa"/>
+          <w:jc w:val="center"/>
+        </w:trPr>
+        <w:tc>
+          <w:tcPr>
+            <w:tcW w:w="1691" w:type="dxa"/>
+            <w:shd w:val="clear"/>
+            <w:vAlign w:val="center"/>
+          </w:tcPr>
+          <w:p>
+            <w:pPr>
+              <w:keepNext w:val="0"/>
+              <w:keepLines w:val="0"/>
+              <w:widowControl/>
+              <w:suppressLineNumbers w:val="0"/>
+              <w:snapToGrid w:val="0"/>
+              <w:ind w:left="0" w:leftChars="0" w:right="0" w:rightChars="0" w:firstLine="0" w:firstLineChars="0"/>
+              <w:jc w:val="center"/>
+            </w:pPr>
+            <w:r>
+              <w:rPr>
+                <w:rFonts w:ascii="宋体" w:hAnsi="宋体" w:eastAsia="宋体" w:cs="宋体"/>
+                <w:kern w:val="0"/>
+                <w:sz w:val="24"/>
+                <w:szCs w:val="24"/>
+                <w:lang w:val="en-US" w:eastAsia="zh-CN" w:bidi="ar"/>
+              </w:rPr>
+              <w:t>可用电量</w:t>
+            </w:r>
+          </w:p>
+        </w:tc>
+        <w:tc>
+          <w:tcPr>
+            <w:tcW w:w="4526" w:type="dxa"/>
+            <w:shd w:val="clear"/>
+            <w:vAlign w:val="center"/>
+          </w:tcPr>
+          <w:p>
+            <w:pPr>
+              <w:keepNext w:val="0"/>
+              <w:keepLines w:val="0"/>
+              <w:widowControl/>
+              <w:suppressLineNumbers w:val="0"/>
+              <w:snapToGrid w:val="0"/>
+              <w:ind w:left="0" w:leftChars="0" w:right="0" w:rightChars="0" w:firstLine="0" w:firstLineChars="0"/>
+              <w:jc w:val="left"/>
+            </w:pPr>
+            <w:r>
+              <w:rPr>
+                <w:rFonts w:ascii="宋体" w:hAnsi="宋体" w:eastAsia="宋体" w:cs="宋体"/>
+                <w:kern w:val="0"/>
+                <w:sz w:val="24"/>
+                <w:szCs w:val="24"/>
+                <w:lang w:val="en-US" w:eastAsia="zh-CN" w:bidi="ar"/>
+              </w:rPr>
+              <w:t>约90kWh</w:t>
+            </w:r>
+          </w:p>
+        </w:tc>
+      </w:tr>
+      <w:tr>
+        <w:tblPrEx>
+          <w:tblBorders>
+            <w:top w:val="none" w:color="auto" w:sz="0" w:space="0"/>
+            <w:left w:val="none" w:color="auto" w:sz="0" w:space="0"/>
+            <w:bottom w:val="none" w:color="auto" w:sz="0" w:space="0"/>
+            <w:right w:val="none" w:color="auto" w:sz="0" w:space="0"/>
+            <w:insideH w:val="none" w:color="auto" w:sz="0" w:space="0"/>
+            <w:insideV w:val="none" w:color="auto" w:sz="0" w:space="0"/>
+          </w:tblBorders>
+          <w:shd w:val="clear"/>
+          <w:tblCellMar>
+            <w:top w:w="15" w:type="dxa"/>
+            <w:left w:w="15" w:type="dxa"/>
+            <w:bottom w:w="15" w:type="dxa"/>
+            <w:right w:w="15" w:type="dxa"/>
+          </w:tblCellMar>
+        </w:tblPrEx>
+        <w:trPr>
+          <w:trHeight w:val="0" w:hRule="atLeast"/>
+          <w:tblCellSpacing w:w="15" w:type="dxa"/>
+          <w:jc w:val="center"/>
+        </w:trPr>
+        <w:tc>
+          <w:tcPr>
+            <w:tcW w:w="1691" w:type="dxa"/>
+            <w:shd w:val="clear"/>
+            <w:vAlign w:val="center"/>
+          </w:tcPr>
+          <w:p>
+            <w:pPr>
+              <w:keepNext w:val="0"/>
+              <w:keepLines w:val="0"/>
+              <w:widowControl/>
+              <w:suppressLineNumbers w:val="0"/>
+              <w:snapToGrid w:val="0"/>
+              <w:ind w:left="0" w:leftChars="0" w:right="0" w:rightChars="0" w:firstLine="0" w:firstLineChars="0"/>
+              <w:jc w:val="center"/>
+            </w:pPr>
+            <w:r>
+              <w:rPr>
+                <w:rFonts w:ascii="宋体" w:hAnsi="宋体" w:eastAsia="宋体" w:cs="宋体"/>
+                <w:kern w:val="0"/>
+                <w:sz w:val="24"/>
+                <w:szCs w:val="24"/>
+                <w:lang w:val="en-US" w:eastAsia="zh-CN" w:bidi="ar"/>
+              </w:rPr>
+              <w:t>冷却方式</w:t>
+            </w:r>
+          </w:p>
+        </w:tc>
+        <w:tc>
+          <w:tcPr>
+            <w:tcW w:w="4526" w:type="dxa"/>
+            <w:shd w:val="clear"/>
+            <w:vAlign w:val="center"/>
+          </w:tcPr>
+          <w:p>
+            <w:pPr>
+              <w:keepNext w:val="0"/>
+              <w:keepLines w:val="0"/>
+              <w:widowControl/>
+              <w:suppressLineNumbers w:val="0"/>
+              <w:snapToGrid w:val="0"/>
+              <w:ind w:left="0" w:leftChars="0" w:right="0" w:rightChars="0" w:firstLine="0" w:firstLineChars="0"/>
+              <w:jc w:val="left"/>
+            </w:pPr>
+            <w:r>
+              <w:rPr>
+                <w:rFonts w:ascii="宋体" w:hAnsi="宋体" w:eastAsia="宋体" w:cs="宋体"/>
+                <w:kern w:val="0"/>
+                <w:sz w:val="24"/>
+                <w:szCs w:val="24"/>
+                <w:lang w:val="en-US" w:eastAsia="zh-CN" w:bidi="ar"/>
+              </w:rPr>
+              <w:t>液冷</w:t>
+            </w:r>
+          </w:p>
+        </w:tc>
+      </w:tr>
+      <w:tr>
+        <w:tblPrEx>
+          <w:tblBorders>
+            <w:top w:val="none" w:color="auto" w:sz="0" w:space="0"/>
+            <w:left w:val="none" w:color="auto" w:sz="0" w:space="0"/>
+            <w:bottom w:val="none" w:color="auto" w:sz="0" w:space="0"/>
+            <w:right w:val="none" w:color="auto" w:sz="0" w:space="0"/>
+            <w:insideH w:val="none" w:color="auto" w:sz="0" w:space="0"/>
+            <w:insideV w:val="none" w:color="auto" w:sz="0" w:space="0"/>
+          </w:tblBorders>
+          <w:shd w:val="clear"/>
+          <w:tblCellMar>
+            <w:top w:w="15" w:type="dxa"/>
+            <w:left w:w="15" w:type="dxa"/>
+            <w:bottom w:w="15" w:type="dxa"/>
+            <w:right w:w="15" w:type="dxa"/>
+          </w:tblCellMar>
+        </w:tblPrEx>
+        <w:trPr>
+          <w:trHeight w:val="0" w:hRule="atLeast"/>
+          <w:tblCellSpacing w:w="15" w:type="dxa"/>
+          <w:jc w:val="center"/>
+        </w:trPr>
+        <w:tc>
+          <w:tcPr>
+            <w:tcW w:w="1691" w:type="dxa"/>
+            <w:shd w:val="clear"/>
+            <w:vAlign w:val="center"/>
+          </w:tcPr>
+          <w:p>
+            <w:pPr>
+              <w:keepNext w:val="0"/>
+              <w:keepLines w:val="0"/>
+              <w:widowControl/>
+              <w:suppressLineNumbers w:val="0"/>
+              <w:snapToGrid w:val="0"/>
+              <w:ind w:left="0" w:leftChars="0" w:right="0" w:rightChars="0" w:firstLine="0" w:firstLineChars="0"/>
+              <w:jc w:val="center"/>
+            </w:pPr>
+            <w:r>
+              <w:rPr>
+                <w:rFonts w:ascii="宋体" w:hAnsi="宋体" w:eastAsia="宋体" w:cs="宋体"/>
+                <w:kern w:val="0"/>
+                <w:sz w:val="24"/>
+                <w:szCs w:val="24"/>
+                <w:lang w:val="en-US" w:eastAsia="zh-CN" w:bidi="ar"/>
+              </w:rPr>
+              <w:t>布置位置</w:t>
+            </w:r>
+          </w:p>
+        </w:tc>
+        <w:tc>
+          <w:tcPr>
+            <w:tcW w:w="4526" w:type="dxa"/>
+            <w:shd w:val="clear"/>
+            <w:vAlign w:val="center"/>
+          </w:tcPr>
+          <w:p>
+            <w:pPr>
+              <w:keepNext w:val="0"/>
+              <w:keepLines w:val="0"/>
+              <w:widowControl/>
+              <w:suppressLineNumbers w:val="0"/>
+              <w:snapToGrid w:val="0"/>
+              <w:ind w:left="0" w:leftChars="0" w:right="0" w:rightChars="0" w:firstLine="0" w:firstLineChars="0"/>
+              <w:jc w:val="left"/>
+            </w:pPr>
+            <w:r>
+              <w:rPr>
+                <w:rFonts w:ascii="宋体" w:hAnsi="宋体" w:eastAsia="宋体" w:cs="宋体"/>
+                <w:kern w:val="0"/>
+                <w:sz w:val="24"/>
+                <w:szCs w:val="24"/>
+                <w:lang w:val="en-US" w:eastAsia="zh-CN" w:bidi="ar"/>
+              </w:rPr>
+              <w:t>车架两侧/车架中部下方</w:t>
+            </w:r>
+          </w:p>
+        </w:tc>
+      </w:tr>
+      <w:tr>
+        <w:tblPrEx>
+          <w:tblBorders>
+            <w:top w:val="none" w:color="auto" w:sz="0" w:space="0"/>
+            <w:left w:val="none" w:color="auto" w:sz="0" w:space="0"/>
+            <w:bottom w:val="none" w:color="auto" w:sz="0" w:space="0"/>
+            <w:right w:val="none" w:color="auto" w:sz="0" w:space="0"/>
+            <w:insideH w:val="none" w:color="auto" w:sz="0" w:space="0"/>
+            <w:insideV w:val="none" w:color="auto" w:sz="0" w:space="0"/>
+          </w:tblBorders>
+          <w:shd w:val="clear"/>
+          <w:tblCellMar>
+            <w:top w:w="15" w:type="dxa"/>
+            <w:left w:w="15" w:type="dxa"/>
+            <w:bottom w:w="15" w:type="dxa"/>
+            <w:right w:w="15" w:type="dxa"/>
+          </w:tblCellMar>
+        </w:tblPrEx>
+        <w:trPr>
+          <w:trHeight w:val="0" w:hRule="atLeast"/>
+          <w:tblCellSpacing w:w="15" w:type="dxa"/>
+          <w:jc w:val="center"/>
+        </w:trPr>
+        <w:tc>
+          <w:tcPr>
+            <w:tcW w:w="1691" w:type="dxa"/>
+            <w:shd w:val="clear"/>
+            <w:vAlign w:val="center"/>
+          </w:tcPr>
+          <w:p>
+            <w:pPr>
+              <w:keepNext w:val="0"/>
+              <w:keepLines w:val="0"/>
+              <w:widowControl/>
+              <w:suppressLineNumbers w:val="0"/>
+              <w:snapToGrid w:val="0"/>
+              <w:ind w:left="0" w:leftChars="0" w:right="0" w:rightChars="0" w:firstLine="0" w:firstLineChars="0"/>
+              <w:jc w:val="center"/>
+            </w:pPr>
+            <w:r>
+              <w:rPr>
+                <w:rFonts w:ascii="宋体" w:hAnsi="宋体" w:eastAsia="宋体" w:cs="宋体"/>
+                <w:kern w:val="0"/>
+                <w:sz w:val="24"/>
+                <w:szCs w:val="24"/>
+                <w:lang w:val="en-US" w:eastAsia="zh-CN" w:bidi="ar"/>
+              </w:rPr>
+              <w:t>充电方式</w:t>
+            </w:r>
+          </w:p>
+        </w:tc>
+        <w:tc>
+          <w:tcPr>
+            <w:tcW w:w="4526" w:type="dxa"/>
+            <w:shd w:val="clear"/>
+            <w:vAlign w:val="center"/>
+          </w:tcPr>
+          <w:p>
+            <w:pPr>
+              <w:keepNext w:val="0"/>
+              <w:keepLines w:val="0"/>
+              <w:widowControl/>
+              <w:suppressLineNumbers w:val="0"/>
+              <w:snapToGrid w:val="0"/>
+              <w:ind w:left="0" w:leftChars="0" w:right="0" w:rightChars="0" w:firstLine="0" w:firstLineChars="0"/>
+              <w:jc w:val="left"/>
+            </w:pPr>
+            <w:r>
+              <w:rPr>
+                <w:rFonts w:ascii="宋体" w:hAnsi="宋体" w:eastAsia="宋体" w:cs="宋体"/>
+                <w:kern w:val="0"/>
+                <w:sz w:val="24"/>
+                <w:szCs w:val="24"/>
+                <w:lang w:val="en-US" w:eastAsia="zh-CN" w:bidi="ar"/>
+              </w:rPr>
+              <w:t>直流快充+交流慢充</w:t>
+            </w:r>
+          </w:p>
+        </w:tc>
+      </w:tr>
+      <w:tr>
+        <w:tblPrEx>
+          <w:tblBorders>
+            <w:top w:val="none" w:color="auto" w:sz="0" w:space="0"/>
+            <w:left w:val="none" w:color="auto" w:sz="0" w:space="0"/>
+            <w:bottom w:val="none" w:color="auto" w:sz="0" w:space="0"/>
+            <w:right w:val="none" w:color="auto" w:sz="0" w:space="0"/>
+            <w:insideH w:val="none" w:color="auto" w:sz="0" w:space="0"/>
+            <w:insideV w:val="none" w:color="auto" w:sz="0" w:space="0"/>
+          </w:tblBorders>
+          <w:shd w:val="clear"/>
+          <w:tblCellMar>
+            <w:top w:w="15" w:type="dxa"/>
+            <w:left w:w="15" w:type="dxa"/>
+            <w:bottom w:w="15" w:type="dxa"/>
+            <w:right w:w="15" w:type="dxa"/>
+          </w:tblCellMar>
+        </w:tblPrEx>
+        <w:trPr>
+          <w:trHeight w:val="0" w:hRule="atLeast"/>
+          <w:tblCellSpacing w:w="15" w:type="dxa"/>
+          <w:jc w:val="center"/>
+        </w:trPr>
+        <w:tc>
+          <w:tcPr>
+            <w:tcW w:w="1691" w:type="dxa"/>
+            <w:shd w:val="clear"/>
+            <w:vAlign w:val="center"/>
+          </w:tcPr>
+          <w:p>
+            <w:pPr>
+              <w:keepNext w:val="0"/>
+              <w:keepLines w:val="0"/>
+              <w:widowControl/>
+              <w:suppressLineNumbers w:val="0"/>
+              <w:snapToGrid w:val="0"/>
+              <w:ind w:left="0" w:leftChars="0" w:right="0" w:rightChars="0" w:firstLine="0" w:firstLineChars="0"/>
+              <w:jc w:val="center"/>
+            </w:pPr>
+            <w:r>
+              <w:rPr>
+                <w:rFonts w:ascii="宋体" w:hAnsi="宋体" w:eastAsia="宋体" w:cs="宋体"/>
+                <w:kern w:val="0"/>
+                <w:sz w:val="24"/>
+                <w:szCs w:val="24"/>
+                <w:lang w:val="en-US" w:eastAsia="zh-CN" w:bidi="ar"/>
+              </w:rPr>
+              <w:t>BMS</w:t>
+            </w:r>
+          </w:p>
+        </w:tc>
+        <w:tc>
+          <w:tcPr>
+            <w:tcW w:w="4526" w:type="dxa"/>
+            <w:shd w:val="clear"/>
+            <w:vAlign w:val="center"/>
+          </w:tcPr>
+          <w:p>
+            <w:pPr>
+              <w:keepNext w:val="0"/>
+              <w:keepLines w:val="0"/>
+              <w:widowControl/>
+              <w:suppressLineNumbers w:val="0"/>
+              <w:snapToGrid w:val="0"/>
+              <w:ind w:left="0" w:leftChars="0" w:right="0" w:rightChars="0" w:firstLine="0" w:firstLineChars="0"/>
+              <w:jc w:val="left"/>
+            </w:pPr>
+            <w:r>
+              <w:rPr>
+                <w:rFonts w:ascii="宋体" w:hAnsi="宋体" w:eastAsia="宋体" w:cs="宋体"/>
+                <w:kern w:val="0"/>
+                <w:sz w:val="24"/>
+                <w:szCs w:val="24"/>
+                <w:lang w:val="en-US" w:eastAsia="zh-CN" w:bidi="ar"/>
+              </w:rPr>
+              <w:t>具备过充、过放、过温、绝缘监测功能</w:t>
+            </w:r>
+          </w:p>
+        </w:tc>
+      </w:tr>
+    </w:tbl>
+    <w:p>
+      <w:pPr>
+        <w:pStyle w:val="3"/>
+        <w:rPr>
+          <w:rFonts w:hint="default"/>
+          <w:lang w:val="en-US" w:eastAsia="zh-CN"/>
+        </w:rPr>
+      </w:pPr>
     </w:p>
     <w:bookmarkEnd w:id="21"/>
     <w:p>
@@ -7255,8 +7669,8 @@
       </w:tblPr>
       <w:tblGrid>
         <w:gridCol w:w="850"/>
-        <w:gridCol w:w="1493"/>
-        <w:gridCol w:w="6513"/>
+        <w:gridCol w:w="1754"/>
+        <w:gridCol w:w="6252"/>
       </w:tblGrid>
       <w:tr>
         <w:tblPrEx>
@@ -7284,6 +7698,9 @@
           </w:p>
         </w:tc>
         <w:tc>
+          <w:tcPr>
+            <w:tcW w:w="1754" w:type="dxa"/>
+          </w:tcPr>
           <w:p>
             <w:pPr>
               <w:pStyle w:val="25"/>
@@ -7297,6 +7714,9 @@
           </w:p>
         </w:tc>
         <w:tc>
+          <w:tcPr>
+            <w:tcW w:w="6252" w:type="dxa"/>
+          </w:tcPr>
           <w:p>
             <w:pPr>
               <w:pStyle w:val="25"/>
@@ -7342,6 +7762,9 @@
           </w:p>
         </w:tc>
         <w:tc>
+          <w:tcPr>
+            <w:tcW w:w="1754" w:type="dxa"/>
+          </w:tcPr>
           <w:p>
             <w:pPr>
               <w:pStyle w:val="25"/>
@@ -7355,6 +7778,9 @@
           </w:p>
         </w:tc>
         <w:tc>
+          <w:tcPr>
+            <w:tcW w:w="6252" w:type="dxa"/>
+          </w:tcPr>
           <w:p>
             <w:pPr>
               <w:pStyle w:val="25"/>
@@ -7391,6 +7817,9 @@
           </w:p>
         </w:tc>
         <w:tc>
+          <w:tcPr>
+            <w:tcW w:w="1754" w:type="dxa"/>
+          </w:tcPr>
           <w:p>
             <w:pPr>
               <w:pStyle w:val="25"/>
@@ -7401,6 +7830,9 @@
           </w:p>
         </w:tc>
         <w:tc>
+          <w:tcPr>
+            <w:tcW w:w="6252" w:type="dxa"/>
+          </w:tcPr>
           <w:p>
             <w:pPr>
               <w:pStyle w:val="25"/>
@@ -7439,31 +7871,7 @@
               <w:t>峰值功率</w:t>
             </w:r>
             <w:r>
-              <w:t>120kW(</w:t>
-            </w:r>
-            <w:r>
-              <w:fldChar w:fldCharType="begin"/>
-            </w:r>
-            <w:r>
-              <w:instrText xml:space="preserve"> HYPERLINK "https://product.360che.com/m756/189051_index.html?utm_source=chatgpt.com" \h </w:instrText>
-            </w:r>
-            <w:r>
-              <w:fldChar w:fldCharType="separate"/>
-            </w:r>
-            <w:r>
-              <w:rPr>
-                <w:rStyle w:val="21"/>
-              </w:rPr>
-              <w:t>product.360che.com</w:t>
-            </w:r>
-            <w:r>
-              <w:rPr>
-                <w:rStyle w:val="21"/>
-              </w:rPr>
-              <w:fldChar w:fldCharType="end"/>
-            </w:r>
-            <w:r>
-              <w:t>)</w:t>
+              <w:t>120kW</w:t>
             </w:r>
           </w:p>
         </w:tc>
@@ -7491,6 +7899,9 @@
           </w:p>
         </w:tc>
         <w:tc>
+          <w:tcPr>
+            <w:tcW w:w="1754" w:type="dxa"/>
+          </w:tcPr>
           <w:p>
             <w:pPr>
               <w:pStyle w:val="25"/>
@@ -7502,20 +7913,33 @@
               <w:t>约</w:t>
             </w:r>
             <w:r>
-              <w:t>550N·m</w:t>
-            </w:r>
-          </w:p>
-        </w:tc>
-        <w:tc>
-          <w:p>
-            <w:pPr>
-              <w:pStyle w:val="25"/>
-            </w:pPr>
-            <w:r>
-              <w:rPr>
-                <w:rFonts w:hint="eastAsia"/>
-              </w:rPr>
-              <w:t>根据满载爬坡需求估算</w:t>
+              <w:rPr>
+                <w:rFonts w:ascii="宋体" w:hAnsi="宋体" w:eastAsia="宋体" w:cs="宋体"/>
+                <w:sz w:val="24"/>
+                <w:szCs w:val="24"/>
+              </w:rPr>
+              <w:t>325N·m</w:t>
+            </w:r>
+          </w:p>
+        </w:tc>
+        <w:tc>
+          <w:tcPr>
+            <w:tcW w:w="6252" w:type="dxa"/>
+          </w:tcPr>
+          <w:p>
+            <w:pPr>
+              <w:pStyle w:val="25"/>
+              <w:rPr>
+                <w:rFonts w:hint="default" w:eastAsia="宋体"/>
+                <w:lang w:val="en-US" w:eastAsia="zh-CN"/>
+              </w:rPr>
+            </w:pPr>
+            <w:r>
+              <w:rPr>
+                <w:rFonts w:hint="eastAsia"/>
+                <w:lang w:val="en-US" w:eastAsia="zh-CN"/>
+              </w:rPr>
+              <w:t>根据所选电机的最大输出扭矩确定</w:t>
             </w:r>
           </w:p>
         </w:tc>
@@ -7543,16 +7967,29 @@
           </w:p>
         </w:tc>
         <w:tc>
-          <w:p>
-            <w:pPr>
-              <w:pStyle w:val="25"/>
-            </w:pPr>
-            <w:r>
-              <w:t>60–80kW</w:t>
-            </w:r>
-          </w:p>
-        </w:tc>
-        <w:tc>
+          <w:tcPr>
+            <w:tcW w:w="1754" w:type="dxa"/>
+          </w:tcPr>
+          <w:p>
+            <w:pPr>
+              <w:pStyle w:val="25"/>
+            </w:pPr>
+            <w:r>
+              <w:rPr>
+                <w:rFonts w:hint="eastAsia"/>
+                <w:lang w:val="en-US" w:eastAsia="zh-CN"/>
+              </w:rPr>
+              <w:t>65</w:t>
+            </w:r>
+            <w:r>
+              <w:t>kW</w:t>
+            </w:r>
+          </w:p>
+        </w:tc>
+        <w:tc>
+          <w:tcPr>
+            <w:tcW w:w="6252" w:type="dxa"/>
+          </w:tcPr>
           <w:p>
             <w:pPr>
               <w:pStyle w:val="25"/>
@@ -7564,7 +8001,7 @@
               <w:t>按峰值功率约</w:t>
             </w:r>
             <w:r>
-              <w:t>50%–65%</w:t>
+              <w:t>65%</w:t>
             </w:r>
             <w:r>
               <w:rPr>
@@ -7598,22 +8035,29 @@
           </w:p>
         </w:tc>
         <w:tc>
-          <w:p>
-            <w:pPr>
-              <w:pStyle w:val="25"/>
-            </w:pPr>
-            <w:r>
-              <w:rPr>
-                <w:rFonts w:hint="eastAsia"/>
-              </w:rPr>
-              <w:t>约</w:t>
-            </w:r>
-            <w:r>
-              <w:t>6000r/min</w:t>
-            </w:r>
-          </w:p>
-        </w:tc>
-        <w:tc>
+          <w:tcPr>
+            <w:tcW w:w="1754" w:type="dxa"/>
+          </w:tcPr>
+          <w:p>
+            <w:pPr>
+              <w:pStyle w:val="25"/>
+            </w:pPr>
+            <w:r>
+              <w:rPr>
+                <w:rFonts w:hint="eastAsia"/>
+                <w:lang w:val="en-US" w:eastAsia="zh-CN"/>
+              </w:rPr>
+              <w:t>10</w:t>
+            </w:r>
+            <w:r>
+              <w:t>000r/min</w:t>
+            </w:r>
+          </w:p>
+        </w:tc>
+        <w:tc>
+          <w:tcPr>
+            <w:tcW w:w="6252" w:type="dxa"/>
+          </w:tcPr>
           <w:p>
             <w:pPr>
               <w:pStyle w:val="25"/>
@@ -7650,6 +8094,9 @@
           </w:p>
         </w:tc>
         <w:tc>
+          <w:tcPr>
+            <w:tcW w:w="1754" w:type="dxa"/>
+          </w:tcPr>
           <w:p>
             <w:pPr>
               <w:pStyle w:val="25"/>
@@ -7663,6 +8110,9 @@
           </w:p>
         </w:tc>
         <w:tc>
+          <w:tcPr>
+            <w:tcW w:w="6252" w:type="dxa"/>
+          </w:tcPr>
           <w:p>
             <w:pPr>
               <w:pStyle w:val="25"/>
@@ -7680,8 +8130,9 @@
     <w:p>
       <w:pPr>
         <w:pStyle w:val="3"/>
-        <w:rPr>
-          <w:rFonts w:hint="default" w:eastAsia="宋体"/>
+        <w:bidi w:val="0"/>
+        <w:rPr>
+          <w:rFonts w:hint="default"/>
           <w:lang w:val="en-US" w:eastAsia="zh-CN"/>
         </w:rPr>
       </w:pPr>
@@ -7743,38 +8194,7 @@
         <w:rPr>
           <w:rFonts w:hint="eastAsia"/>
         </w:rPr>
-        <w:t>方案，说明该功率等级能够满足城市配送轻卡的基本动力需求。(</w:t>
-      </w:r>
-      <w:r>
-        <w:fldChar w:fldCharType="begin"/>
-      </w:r>
-      <w:r>
-        <w:instrText xml:space="preserve"> HYPERLINK "https://product.360che.com/m756/189051_index.html?utm_source=chatgpt.com" \h </w:instrText>
-      </w:r>
-      <w:r>
-        <w:fldChar w:fldCharType="separate"/>
-      </w:r>
-      <w:r>
-        <w:rPr>
-          <w:rStyle w:val="21"/>
-        </w:rPr>
-        <w:t>product.360che.com</w:t>
-      </w:r>
-      <w:r>
-        <w:rPr>
-          <w:rStyle w:val="21"/>
-        </w:rPr>
-        <w:fldChar w:fldCharType="end"/>
-      </w:r>
-      <w:r>
-        <w:t>)</w:t>
-      </w:r>
-      <w:r>
-        <w:rPr>
-          <w:rFonts w:hint="eastAsia"/>
-          <w:lang w:val="en-US" w:eastAsia="zh-CN"/>
-        </w:rPr>
-        <w:t>nn</w:t>
+        <w:t>方案，说明该功率等级能够满足城市配送轻卡的基本动力需求。</w:t>
       </w:r>
     </w:p>
     <w:p>
@@ -7838,14 +8258,67 @@
     <w:p>
       <w:pPr>
         <w:pStyle w:val="13"/>
-      </w:pPr>
-      <w:r>
-        <w:rPr>
-          <w:b/>
-          <w:bCs/>
-        </w:rPr>
-        <w:t>vmax=90km/h</w:t>
-      </w:r>
+        <w:rPr>
+          <w:rFonts w:hint="default" w:eastAsia="宋体"/>
+          <w:lang w:val="en-US" w:eastAsia="zh-CN"/>
+        </w:rPr>
+      </w:pPr>
+      <m:oMathPara>
+        <m:oMath>
+          <m:sSub>
+            <m:sSubPr>
+              <m:ctrlPr>
+                <w:rPr>
+                  <w:rFonts w:hint="default" w:ascii="Cambria Math" w:hAnsi="Cambria Math"/>
+                  <w:sz w:val="24"/>
+                </w:rPr>
+              </m:ctrlPr>
+            </m:sSubPr>
+            <m:e>
+              <m:r>
+                <m:rPr/>
+                <w:rPr>
+                  <w:rFonts w:hint="default" w:ascii="Cambria Math" w:hAnsi="Cambria Math"/>
+                  <w:sz w:val="24"/>
+                </w:rPr>
+                <m:t>v</m:t>
+              </m:r>
+              <m:ctrlPr>
+                <w:rPr>
+                  <w:rFonts w:ascii="Cambria Math" w:hAnsi="Cambria Math"/>
+                  <w:sz w:val="24"/>
+                </w:rPr>
+              </m:ctrlPr>
+            </m:e>
+            <m:sub>
+              <m:r>
+                <m:rPr>
+                  <m:sty m:val="p"/>
+                </m:rPr>
+                <w:rPr>
+                  <w:rFonts w:hint="default" w:ascii="Cambria Math" w:hAnsi="Cambria Math"/>
+                  <w:sz w:val="24"/>
+                </w:rPr>
+                <m:t>max</m:t>
+              </m:r>
+              <m:ctrlPr>
+                <w:rPr>
+                  <w:rFonts w:ascii="Cambria Math" w:hAnsi="Cambria Math"/>
+                  <w:sz w:val="24"/>
+                </w:rPr>
+              </m:ctrlPr>
+            </m:sub>
+          </m:sSub>
+          <m:r>
+            <m:rPr/>
+            <w:rPr>
+              <w:rFonts w:hint="default" w:ascii="Cambria Math" w:hAnsi="Cambria Math"/>
+              <w:sz w:val="24"/>
+            </w:rPr>
+            <m:t>=100km/h</m:t>
+          </m:r>
+        </m:oMath>
+      </m:oMathPara>
     </w:p>
     <w:p>
       <w:pPr>
@@ -7873,45 +8346,13 @@
         <w:rPr>
           <w:rFonts w:hint="eastAsia"/>
         </w:rPr>
-        <w:t>km/h，因此本设计取</w:t>
-      </w:r>
-      <w:r>
-        <w:t>90km/h</w:t>
-      </w:r>
-      <w:r>
-        <w:rPr>
-          <w:rFonts w:hint="eastAsia"/>
-        </w:rPr>
-        <w:t>较为保守。(</w:t>
-      </w:r>
-      <w:r>
-        <w:fldChar w:fldCharType="begin"/>
-      </w:r>
-      <w:r>
-        <w:instrText xml:space="preserve"> HYPERLINK "https://www.pixoville.com/www/product/truck/203517.html?utm_source=chatgpt.com" \h </w:instrText>
-      </w:r>
-      <w:r>
-        <w:fldChar w:fldCharType="separate"/>
-      </w:r>
-      <w:r>
-        <w:rPr>
-          <w:rStyle w:val="21"/>
-        </w:rPr>
-        <w:t>pixoville.com</w:t>
-      </w:r>
-      <w:r>
-        <w:rPr>
-          <w:rStyle w:val="21"/>
-        </w:rPr>
-        <w:fldChar w:fldCharType="end"/>
-      </w:r>
-      <w:r>
-        <w:t>)</w:t>
+        <w:t>km/h，</w:t>
       </w:r>
     </w:p>
     <w:p>
       <w:pPr>
         <w:pStyle w:val="3"/>
+        <w:bidi w:val="0"/>
       </w:pPr>
       <w:r>
         <w:rPr>
@@ -7935,17 +8376,9 @@
       </w:tblPr>
       <w:tblGrid>
         <w:gridCol w:w="2256"/>
-        <w:gridCol w:w="936"/>
+        <w:gridCol w:w="1056"/>
       </w:tblGrid>
       <w:tr>
-        <w:tblPrEx>
-          <w:tblCellMar>
-            <w:top w:w="0" w:type="dxa"/>
-            <w:left w:w="108" w:type="dxa"/>
-            <w:bottom w:w="0" w:type="dxa"/>
-            <w:right w:w="108" w:type="dxa"/>
-          </w:tblCellMar>
-        </w:tblPrEx>
         <w:trPr>
           <w:tblHeader/>
         </w:trPr>
@@ -8004,7 +8437,14 @@
               <w:pStyle w:val="25"/>
             </w:pPr>
             <w:r>
-              <w:t>90km/h</w:t>
+              <w:rPr>
+                <w:rFonts w:hint="eastAsia"/>
+                <w:lang w:val="en-US" w:eastAsia="zh-CN"/>
+              </w:rPr>
+              <w:t>100</w:t>
+            </w:r>
+            <w:r>
+              <w:t>km/h</w:t>
             </w:r>
           </w:p>
         </w:tc>
@@ -8121,6 +8561,7 @@
     <w:p>
       <w:pPr>
         <w:pStyle w:val="3"/>
+        <w:bidi w:val="0"/>
       </w:pPr>
       <w:r>
         <w:rPr>
@@ -8132,6 +8573,7 @@
     <w:p>
       <w:pPr>
         <w:pStyle w:val="3"/>
+        <w:bidi w:val="0"/>
       </w:pPr>
       <m:oMathPara>
         <m:oMathParaPr>
@@ -8142,13 +8584,23 @@
             <m:sSubPr/>
             <m:e>
               <m:r>
-                <m:rPr/>
+                <m:rPr>
+                  <m:sty m:val="p"/>
+                </m:rPr>
+                <w:rPr>
+                  <w:rFonts w:ascii="Times New Roman" w:hAnsi="Times New Roman"/>
+                </w:rPr>
                 <m:t>n</m:t>
               </m:r>
             </m:e>
             <m:sub>
               <m:r>
-                <m:rPr/>
+                <m:rPr>
+                  <m:sty m:val="p"/>
+                </m:rPr>
+                <w:rPr>
+                  <w:rFonts w:ascii="Times New Roman" w:hAnsi="Times New Roman"/>
+                </w:rPr>
                 <m:t>w</m:t>
               </m:r>
             </m:sub>
@@ -8157,19 +8609,32 @@
             <m:rPr>
               <m:sty m:val="p"/>
             </m:rPr>
+            <w:rPr>
+              <w:rFonts w:ascii="Times New Roman" w:hAnsi="Times New Roman"/>
+            </w:rPr>
             <m:t>=</m:t>
           </m:r>
           <m:f>
             <m:fPr/>
             <m:num>
               <m:r>
-                <m:rPr/>
+                <m:rPr>
+                  <m:sty m:val="p"/>
+                </m:rPr>
+                <w:rPr>
+                  <w:rFonts w:ascii="Times New Roman" w:hAnsi="Times New Roman"/>
+                </w:rPr>
                 <m:t>v</m:t>
               </m:r>
             </m:num>
             <m:den>
               <m:r>
-                <m:rPr/>
+                <m:rPr>
+                  <m:sty m:val="p"/>
+                </m:rPr>
+                <w:rPr>
+                  <w:rFonts w:ascii="Times New Roman" w:hAnsi="Times New Roman"/>
+                </w:rPr>
                 <m:t>2πr</m:t>
               </m:r>
             </m:den>
@@ -8178,11 +8643,10 @@
             <m:rPr>
               <m:sty m:val="p"/>
             </m:rPr>
-            <m:t>×</m:t>
-          </m:r>
-          <m:r>
-            <m:rPr/>
-            <m:t>60</m:t>
+            <w:rPr>
+              <w:rFonts w:ascii="Times New Roman" w:hAnsi="Times New Roman"/>
+            </w:rPr>
+            <m:t>×60</m:t>
           </m:r>
         </m:oMath>
       </m:oMathPara>
@@ -8219,6 +8683,7 @@
     <w:p>
       <w:pPr>
         <w:pStyle w:val="3"/>
+        <w:bidi w:val="0"/>
       </w:pPr>
       <m:oMathPara>
         <m:oMathParaPr>
@@ -8229,13 +8694,23 @@
             <m:sSubPr/>
             <m:e>
               <m:r>
-                <m:rPr/>
+                <m:rPr>
+                  <m:sty m:val="p"/>
+                </m:rPr>
+                <w:rPr>
+                  <w:rFonts w:ascii="Times New Roman" w:hAnsi="Times New Roman"/>
+                </w:rPr>
                 <m:t>n</m:t>
               </m:r>
             </m:e>
             <m:sub>
               <m:r>
-                <m:rPr/>
+                <m:rPr>
+                  <m:sty m:val="p"/>
+                </m:rPr>
+                <w:rPr>
+                  <w:rFonts w:ascii="Times New Roman" w:hAnsi="Times New Roman"/>
+                </w:rPr>
                 <m:t>w</m:t>
               </m:r>
             </m:sub>
@@ -8244,30 +8719,33 @@
             <m:rPr>
               <m:sty m:val="p"/>
             </m:rPr>
+            <w:rPr>
+              <w:rFonts w:ascii="Times New Roman" w:hAnsi="Times New Roman"/>
+            </w:rPr>
             <m:t>=</m:t>
           </m:r>
           <m:f>
             <m:fPr/>
             <m:num>
               <m:r>
-                <m:rPr/>
+                <m:rPr>
+                  <m:sty m:val="p"/>
+                </m:rPr>
+                <w:rPr>
+                  <w:rFonts w:ascii="Times New Roman" w:hAnsi="Times New Roman"/>
+                </w:rPr>
                 <m:t>25</m:t>
               </m:r>
             </m:num>
             <m:den>
               <m:r>
-                <m:rPr/>
-                <m:t>2π</m:t>
-              </m:r>
-              <m:r>
                 <m:rPr>
                   <m:sty m:val="p"/>
                 </m:rPr>
-                <m:t>×</m:t>
-              </m:r>
-              <m:r>
-                <m:rPr/>
-                <m:t>0.36</m:t>
+                <w:rPr>
+                  <w:rFonts w:ascii="Times New Roman" w:hAnsi="Times New Roman"/>
+                </w:rPr>
+                <m:t>2π×0.36</m:t>
               </m:r>
             </m:den>
           </m:f>
@@ -8275,31 +8753,10 @@
             <m:rPr>
               <m:sty m:val="p"/>
             </m:rPr>
-            <m:t>×</m:t>
-          </m:r>
-          <m:r>
-            <m:rPr/>
-            <m:t>60</m:t>
-          </m:r>
-          <m:r>
-            <m:rPr>
-              <m:sty m:val="p"/>
-            </m:rPr>
-            <m:t>≈</m:t>
-          </m:r>
-          <m:r>
-            <m:rPr/>
-            <m:t>663 r</m:t>
-          </m:r>
-          <m:r>
-            <m:rPr>
-              <m:sty m:val="p"/>
-            </m:rPr>
-            <m:t>/</m:t>
-          </m:r>
-          <m:r>
-            <m:rPr/>
-            <m:t>min</m:t>
+            <w:rPr>
+              <w:rFonts w:ascii="Times New Roman" w:hAnsi="Times New Roman"/>
+            </w:rPr>
+            <m:t>×60≈663 r/min</m:t>
           </m:r>
         </m:oMath>
       </m:oMathPara>
@@ -8318,6 +8775,7 @@
     <w:p>
       <w:pPr>
         <w:pStyle w:val="3"/>
+        <w:bidi w:val="0"/>
       </w:pPr>
       <m:oMathPara>
         <m:oMathParaPr>
@@ -8328,13 +8786,23 @@
             <m:sSubPr/>
             <m:e>
               <m:r>
-                <m:rPr/>
+                <m:rPr>
+                  <m:sty m:val="p"/>
+                </m:rPr>
+                <w:rPr>
+                  <w:rFonts w:ascii="Times New Roman" w:hAnsi="Times New Roman"/>
+                </w:rPr>
                 <m:t>n</m:t>
               </m:r>
             </m:e>
             <m:sub>
               <m:r>
-                <m:rPr/>
+                <m:rPr>
+                  <m:sty m:val="p"/>
+                </m:rPr>
+                <w:rPr>
+                  <w:rFonts w:ascii="Times New Roman" w:hAnsi="Times New Roman"/>
+                </w:rPr>
                 <m:t>m</m:t>
               </m:r>
             </m:sub>
@@ -8343,41 +8811,10 @@
             <m:rPr>
               <m:sty m:val="p"/>
             </m:rPr>
-            <m:t>=</m:t>
-          </m:r>
-          <m:r>
-            <m:rPr/>
-            <m:t>663</m:t>
-          </m:r>
-          <m:r>
-            <m:rPr>
-              <m:sty m:val="p"/>
-            </m:rPr>
-            <m:t>×</m:t>
-          </m:r>
-          <m:r>
-            <m:rPr/>
-            <m:t>9.0</m:t>
-          </m:r>
-          <m:r>
-            <m:rPr>
-              <m:sty m:val="p"/>
-            </m:rPr>
-            <m:t>≈</m:t>
-          </m:r>
-          <m:r>
-            <m:rPr/>
-            <m:t>5967 r</m:t>
-          </m:r>
-          <m:r>
-            <m:rPr>
-              <m:sty m:val="p"/>
-            </m:rPr>
-            <m:t>/</m:t>
-          </m:r>
-          <m:r>
-            <m:rPr/>
-            <m:t>min</m:t>
+            <w:rPr>
+              <w:rFonts w:ascii="Times New Roman" w:hAnsi="Times New Roman"/>
+            </w:rPr>
+            <m:t>=663×9.0≈5967 r/min</m:t>
           </m:r>
         </m:oMath>
       </m:oMathPara>
@@ -8442,13 +8879,64 @@
       <w:pPr>
         <w:pStyle w:val="13"/>
       </w:pPr>
-      <w:r>
-        <w:rPr>
-          <w:b/>
-          <w:bCs/>
-        </w:rPr>
-        <w:t>imax≥25%</w:t>
-      </w:r>
+      <m:oMathPara>
+        <m:oMath>
+          <m:sSub>
+            <m:sSubPr>
+              <m:ctrlPr>
+                <w:rPr>
+                  <w:rFonts w:hint="default" w:ascii="Cambria Math" w:hAnsi="Cambria Math" w:cs="Times New Roman"/>
+                </w:rPr>
+              </m:ctrlPr>
+            </m:sSubPr>
+            <m:e>
+              <m:r>
+                <m:rPr>
+                  <m:nor/>
+                </m:rPr>
+                <w:rPr>
+                  <w:rFonts w:hint="default" w:ascii="Times New Roman" w:hAnsi="Times New Roman" w:cs="Times New Roman"/>
+                  <w:i/>
+                </w:rPr>
+                <m:t>i</m:t>
+              </m:r>
+              <m:ctrlPr>
+                <w:rPr>
+                  <w:rFonts w:hint="default" w:ascii="Cambria Math" w:hAnsi="Cambria Math" w:cs="Times New Roman"/>
+                </w:rPr>
+              </m:ctrlPr>
+            </m:e>
+            <m:sub>
+              <m:r>
+                <m:rPr>
+                  <m:nor/>
+                  <m:sty m:val="p"/>
+                </m:rPr>
+                <w:rPr>
+                  <w:rFonts w:hint="default" w:ascii="Times New Roman" w:hAnsi="Times New Roman" w:cs="Times New Roman"/>
+                </w:rPr>
+                <m:t>max</m:t>
+              </m:r>
+              <m:ctrlPr>
+                <w:rPr>
+                  <w:rFonts w:hint="default" w:ascii="Cambria Math" w:hAnsi="Cambria Math" w:cs="Times New Roman"/>
+                </w:rPr>
+              </m:ctrlPr>
+            </m:sub>
+          </m:sSub>
+          <m:r>
+            <m:rPr>
+              <m:nor/>
+              <m:sty m:val="p"/>
+            </m:rPr>
+            <w:rPr>
+              <w:rFonts w:hint="default" w:ascii="Times New Roman" w:hAnsi="Times New Roman" w:cs="Times New Roman"/>
+              <w:i w:val="0"/>
+            </w:rPr>
+            <m:t>≥25%</m:t>
+          </m:r>
+        </m:oMath>
+      </m:oMathPara>
     </w:p>
     <w:p>
       <w:pPr>
@@ -8464,6 +8952,7 @@
     <w:p>
       <w:pPr>
         <w:pStyle w:val="3"/>
+        <w:bidi w:val="0"/>
       </w:pPr>
       <m:oMathPara>
         <m:oMathParaPr>
@@ -8471,18 +8960,13 @@
         </m:oMathParaPr>
         <m:oMath>
           <m:r>
-            <m:rPr/>
-            <m:t>m</m:t>
-          </m:r>
-          <m:r>
             <m:rPr>
               <m:sty m:val="p"/>
             </m:rPr>
-            <m:t>=</m:t>
-          </m:r>
-          <m:r>
-            <m:rPr/>
-            <m:t>4495 kg</m:t>
+            <w:rPr>
+              <w:rFonts w:ascii="Times New Roman" w:hAnsi="Times New Roman"/>
+            </w:rPr>
+            <m:t>m=4495 kg</m:t>
           </m:r>
         </m:oMath>
       </m:oMathPara>
@@ -8501,6 +8985,7 @@
     <w:p>
       <w:pPr>
         <w:pStyle w:val="3"/>
+        <w:bidi w:val="0"/>
       </w:pPr>
       <m:oMathPara>
         <m:oMathParaPr>
@@ -8511,13 +8996,23 @@
             <m:sSubPr/>
             <m:e>
               <m:r>
-                <m:rPr/>
+                <m:rPr>
+                  <m:sty m:val="p"/>
+                </m:rPr>
+                <w:rPr>
+                  <w:rFonts w:ascii="Times New Roman" w:hAnsi="Times New Roman"/>
+                </w:rPr>
                 <m:t>F</m:t>
               </m:r>
             </m:e>
             <m:sub>
               <m:r>
-                <m:rPr/>
+                <m:rPr>
+                  <m:sty m:val="p"/>
+                </m:rPr>
+                <w:rPr>
+                  <w:rFonts w:ascii="Times New Roman" w:hAnsi="Times New Roman"/>
+                </w:rPr>
                 <m:t>i</m:t>
               </m:r>
             </m:sub>
@@ -8526,11 +9021,10 @@
             <m:rPr>
               <m:sty m:val="p"/>
             </m:rPr>
-            <m:t>=</m:t>
-          </m:r>
-          <m:r>
-            <m:rPr/>
-            <m:t>mgi</m:t>
+            <w:rPr>
+              <w:rFonts w:ascii="Times New Roman" w:hAnsi="Times New Roman"/>
+            </w:rPr>
+            <m:t>=mgi</m:t>
           </m:r>
         </m:oMath>
       </m:oMathPara>
@@ -8549,6 +9043,7 @@
     <w:p>
       <w:pPr>
         <w:pStyle w:val="3"/>
+        <w:bidi w:val="0"/>
       </w:pPr>
       <m:oMathPara>
         <m:oMathParaPr>
@@ -8559,13 +9054,23 @@
             <m:sSubPr/>
             <m:e>
               <m:r>
-                <m:rPr/>
+                <m:rPr>
+                  <m:sty m:val="p"/>
+                </m:rPr>
+                <w:rPr>
+                  <w:rFonts w:ascii="Times New Roman" w:hAnsi="Times New Roman"/>
+                </w:rPr>
                 <m:t>F</m:t>
               </m:r>
             </m:e>
             <m:sub>
               <m:r>
-                <m:rPr/>
+                <m:rPr>
+                  <m:sty m:val="p"/>
+                </m:rPr>
+                <w:rPr>
+                  <w:rFonts w:ascii="Times New Roman" w:hAnsi="Times New Roman"/>
+                </w:rPr>
                 <m:t>f</m:t>
               </m:r>
             </m:sub>
@@ -8574,11 +9079,10 @@
             <m:rPr>
               <m:sty m:val="p"/>
             </m:rPr>
-            <m:t>=</m:t>
-          </m:r>
-          <m:r>
-            <m:rPr/>
-            <m:t>mgf</m:t>
+            <w:rPr>
+              <w:rFonts w:ascii="Times New Roman" w:hAnsi="Times New Roman"/>
+            </w:rPr>
+            <m:t>=mgf</m:t>
           </m:r>
         </m:oMath>
       </m:oMathPara>
@@ -8597,6 +9101,7 @@
     <w:p>
       <w:pPr>
         <w:pStyle w:val="3"/>
+        <w:bidi w:val="0"/>
       </w:pPr>
       <m:oMathPara>
         <m:oMathParaPr>
@@ -8604,18 +9109,13 @@
         </m:oMathParaPr>
         <m:oMath>
           <m:r>
-            <m:rPr/>
-            <m:t>f</m:t>
-          </m:r>
-          <m:r>
             <m:rPr>
               <m:sty m:val="p"/>
             </m:rPr>
-            <m:t>=</m:t>
-          </m:r>
-          <m:r>
-            <m:rPr/>
-            <m:t>0.015</m:t>
+            <w:rPr>
+              <w:rFonts w:ascii="Times New Roman" w:hAnsi="Times New Roman"/>
+            </w:rPr>
+            <m:t>f=0.015</m:t>
           </m:r>
         </m:oMath>
       </m:oMathPara>
@@ -8639,10 +9139,12 @@
         </w:rPr>
         <w:t>坡度下所需驱动力约为：</w:t>
       </w:r>
-    </w:p>
-    <w:p>
-      <w:pPr>
-        <w:pStyle w:val="3"/>
+      <w:bookmarkStart w:id="44" w:name="_GoBack"/>
+      <w:bookmarkEnd w:id="44"/>
+    </w:p>
+    <w:p>
+      <w:pPr>
+        <w:pStyle w:val="24"/>
       </w:pPr>
       <m:oMathPara>
         <m:oMathParaPr>
@@ -8650,44 +9152,13 @@
         </m:oMathParaPr>
         <m:oMath>
           <m:r>
-            <m:rPr/>
-            <m:t>F</m:t>
-          </m:r>
-          <m:r>
             <m:rPr>
               <m:sty m:val="p"/>
             </m:rPr>
-            <m:t>=</m:t>
-          </m:r>
-          <m:r>
-            <m:rPr/>
-            <m:t>mg</m:t>
-          </m:r>
-          <m:r>
-            <m:rPr>
-              <m:sty m:val="p"/>
-            </m:rPr>
-            <m:t>(</m:t>
-          </m:r>
-          <m:r>
-            <m:rPr/>
-            <m:t>i</m:t>
-          </m:r>
-          <m:r>
-            <m:rPr>
-              <m:sty m:val="p"/>
-            </m:rPr>
-            <m:t>+</m:t>
-          </m:r>
-          <m:r>
-            <m:rPr/>
-            <m:t>f</m:t>
-          </m:r>
-          <m:r>
-            <m:rPr>
-              <m:sty m:val="p"/>
-            </m:rPr>
-            <m:t>)</m:t>
+            <w:rPr>
+              <w:rFonts w:ascii="Times New Roman" w:hAnsi="Times New Roman"/>
+            </w:rPr>
+            <m:t>F=mg(i+f)</m:t>
           </m:r>
         </m:oMath>
       </m:oMathPara>
@@ -8702,58 +9173,13 @@
         </m:oMathParaPr>
         <m:oMath>
           <m:r>
-            <m:rPr/>
-            <m:t>F</m:t>
-          </m:r>
-          <m:r>
             <m:rPr>
               <m:sty m:val="p"/>
             </m:rPr>
-            <m:t>=</m:t>
-          </m:r>
-          <m:r>
-            <m:rPr/>
-            <m:t>4495</m:t>
-          </m:r>
-          <m:r>
-            <m:rPr>
-              <m:sty m:val="p"/>
-            </m:rPr>
-            <m:t>×</m:t>
-          </m:r>
-          <m:r>
-            <m:rPr/>
-            <m:t>9.81</m:t>
-          </m:r>
-          <m:r>
-            <m:rPr>
-              <m:sty m:val="p"/>
-            </m:rPr>
-            <m:t>×(</m:t>
-          </m:r>
-          <m:r>
-            <m:rPr/>
-            <m:t>0.25</m:t>
-          </m:r>
-          <m:r>
-            <m:rPr>
-              <m:sty m:val="p"/>
-            </m:rPr>
-            <m:t>+</m:t>
-          </m:r>
-          <m:r>
-            <m:rPr/>
-            <m:t>0.015</m:t>
-          </m:r>
-          <m:r>
-            <m:rPr>
-              <m:sty m:val="p"/>
-            </m:rPr>
-            <m:t>)≈</m:t>
-          </m:r>
-          <m:r>
-            <m:rPr/>
-            <m:t>11680 N</m:t>
+            <w:rPr>
+              <w:rFonts w:ascii="Times New Roman" w:hAnsi="Times New Roman"/>
+            </w:rPr>
+            <m:t>F=4495×9.81×(0.25+0.015)≈11680 N</m:t>
           </m:r>
         </m:oMath>
       </m:oMathPara>
@@ -8772,6 +9198,7 @@
     <w:p>
       <w:pPr>
         <w:pStyle w:val="3"/>
+        <w:bidi w:val="0"/>
       </w:pPr>
       <m:oMathPara>
         <m:oMathParaPr>
@@ -8782,13 +9209,23 @@
             <m:sSubPr/>
             <m:e>
               <m:r>
-                <m:rPr/>
+                <m:rPr>
+                  <m:sty m:val="p"/>
+                </m:rPr>
+                <w:rPr>
+                  <w:rFonts w:ascii="Times New Roman" w:hAnsi="Times New Roman"/>
+                </w:rPr>
                 <m:t>F</m:t>
               </m:r>
             </m:e>
             <m:sub>
               <m:r>
-                <m:rPr/>
+                <m:rPr>
+                  <m:sty m:val="p"/>
+                </m:rPr>
+                <w:rPr>
+                  <w:rFonts w:ascii="Times New Roman" w:hAnsi="Times New Roman"/>
+                </w:rPr>
                 <m:t>t</m:t>
               </m:r>
             </m:sub>
@@ -8797,6 +9234,9 @@
             <m:rPr>
               <m:sty m:val="p"/>
             </m:rPr>
+            <w:rPr>
+              <w:rFonts w:ascii="Times New Roman" w:hAnsi="Times New Roman"/>
+            </w:rPr>
             <m:t>=</m:t>
           </m:r>
           <m:f>
@@ -8806,13 +9246,23 @@
                 <m:sSubPr/>
                 <m:e>
                   <m:r>
-                    <m:rPr/>
+                    <m:rPr>
+                      <m:sty m:val="p"/>
+                    </m:rPr>
+                    <w:rPr>
+                      <w:rFonts w:ascii="Times New Roman" w:hAnsi="Times New Roman"/>
+                    </w:rPr>
                     <m:t>T</m:t>
                   </m:r>
                 </m:e>
                 <m:sub>
                   <m:r>
-                    <m:rPr/>
+                    <m:rPr>
+                      <m:sty m:val="p"/>
+                    </m:rPr>
+                    <w:rPr>
+                      <w:rFonts w:ascii="Times New Roman" w:hAnsi="Times New Roman"/>
+                    </w:rPr>
                     <m:t>m</m:t>
                   </m:r>
                 </m:sub>
@@ -8821,25 +9271,45 @@
                 <m:sSubPr/>
                 <m:e>
                   <m:r>
-                    <m:rPr/>
+                    <m:rPr>
+                      <m:sty m:val="p"/>
+                    </m:rPr>
+                    <w:rPr>
+                      <w:rFonts w:ascii="Times New Roman" w:hAnsi="Times New Roman"/>
+                    </w:rPr>
                     <m:t>i</m:t>
                   </m:r>
                 </m:e>
                 <m:sub>
                   <m:r>
-                    <m:rPr/>
+                    <m:rPr>
+                      <m:sty m:val="p"/>
+                    </m:rPr>
+                    <w:rPr>
+                      <w:rFonts w:ascii="Times New Roman" w:hAnsi="Times New Roman"/>
+                    </w:rPr>
                     <m:t>g</m:t>
                   </m:r>
                 </m:sub>
               </m:sSub>
               <m:r>
-                <m:rPr/>
+                <m:rPr>
+                  <m:sty m:val="p"/>
+                </m:rPr>
+                <w:rPr>
+                  <w:rFonts w:ascii="Times New Roman" w:hAnsi="Times New Roman"/>
+                </w:rPr>
                 <m:t>η</m:t>
               </m:r>
             </m:num>
             <m:den>
               <m:r>
-                <m:rPr/>
+                <m:rPr>
+                  <m:sty m:val="p"/>
+                </m:rPr>
+                <w:rPr>
+                  <w:rFonts w:ascii="Times New Roman" w:hAnsi="Times New Roman"/>
+                </w:rPr>
                 <m:t>r</m:t>
               </m:r>
             </m:den>
@@ -8879,6 +9349,7 @@
     <w:p>
       <w:pPr>
         <w:pStyle w:val="3"/>
+        <w:bidi w:val="0"/>
       </w:pPr>
       <m:oMathPara>
         <m:oMathParaPr>
@@ -8889,13 +9360,23 @@
             <m:sSubPr/>
             <m:e>
               <m:r>
-                <m:rPr/>
+                <m:rPr>
+                  <m:sty m:val="p"/>
+                </m:rPr>
+                <w:rPr>
+                  <w:rFonts w:ascii="Times New Roman" w:hAnsi="Times New Roman"/>
+                </w:rPr>
                 <m:t>F</m:t>
               </m:r>
             </m:e>
             <m:sub>
               <m:r>
-                <m:rPr/>
+                <m:rPr>
+                  <m:sty m:val="p"/>
+                </m:rPr>
+                <w:rPr>
+                  <w:rFonts w:ascii="Times New Roman" w:hAnsi="Times New Roman"/>
+                </w:rPr>
                 <m:t>t</m:t>
               </m:r>
             </m:sub>
@@ -8904,39 +9385,32 @@
             <m:rPr>
               <m:sty m:val="p"/>
             </m:rPr>
+            <w:rPr>
+              <w:rFonts w:ascii="Times New Roman" w:hAnsi="Times New Roman"/>
+            </w:rPr>
             <m:t>=</m:t>
           </m:r>
           <m:f>
             <m:fPr/>
             <m:num>
               <m:r>
-                <m:rPr/>
-                <m:t>550</m:t>
+                <m:rPr>
+                  <m:sty m:val="p"/>
+                </m:rPr>
+                <w:rPr>
+                  <w:rFonts w:ascii="Times New Roman" w:hAnsi="Times New Roman"/>
+                </w:rPr>
+                <m:t>550×9.0×0.92</m:t>
               </m:r>
+            </m:num>
+            <m:den>
               <m:r>
                 <m:rPr>
                   <m:sty m:val="p"/>
                 </m:rPr>
-                <m:t>×</m:t>
-              </m:r>
-              <m:r>
-                <m:rPr/>
-                <m:t>9.0</m:t>
-              </m:r>
-              <m:r>
-                <m:rPr>
-                  <m:sty m:val="p"/>
-                </m:rPr>
-                <m:t>×</m:t>
-              </m:r>
-              <m:r>
-                <m:rPr/>
-                <m:t>0.92</m:t>
-              </m:r>
-            </m:num>
-            <m:den>
-              <m:r>
-                <m:rPr/>
+                <w:rPr>
+                  <w:rFonts w:ascii="Times New Roman" w:hAnsi="Times New Roman"/>
+                </w:rPr>
                 <m:t>0.36</m:t>
               </m:r>
             </m:den>
@@ -8945,11 +9419,10 @@
             <m:rPr>
               <m:sty m:val="p"/>
             </m:rPr>
-            <m:t>≈</m:t>
-          </m:r>
-          <m:r>
-            <m:rPr/>
-            <m:t>12650 N</m:t>
+            <w:rPr>
+              <w:rFonts w:ascii="Times New Roman" w:hAnsi="Times New Roman"/>
+            </w:rPr>
+            <m:t>≈12650 N</m:t>
           </m:r>
         </m:oMath>
       </m:oMathPara>
@@ -8968,6 +9441,7 @@
     <w:p>
       <w:pPr>
         <w:pStyle w:val="3"/>
+        <w:bidi w:val="0"/>
       </w:pPr>
       <m:oMathPara>
         <m:oMathParaPr>
@@ -8975,18 +9449,13 @@
         </m:oMathParaPr>
         <m:oMath>
           <m:r>
-            <m:rPr/>
-            <m:t>12650 N</m:t>
-          </m:r>
-          <m:r>
             <m:rPr>
               <m:sty m:val="p"/>
             </m:rPr>
-            <m:t>&gt;</m:t>
-          </m:r>
-          <m:r>
-            <m:rPr/>
-            <m:t>11680 N</m:t>
+            <w:rPr>
+              <w:rFonts w:ascii="Times New Roman" w:hAnsi="Times New Roman"/>
+            </w:rPr>
+            <m:t>12650 N&gt;11680 N</m:t>
           </m:r>
         </m:oMath>
       </m:oMathPara>
@@ -9219,6 +9688,7 @@
     <w:p>
       <w:pPr>
         <w:pStyle w:val="3"/>
+        <w:bidi w:val="0"/>
       </w:pPr>
       <w:r>
         <w:rPr>
@@ -9425,6 +9895,7 @@
     <w:p>
       <w:pPr>
         <w:pStyle w:val="3"/>
+        <w:bidi w:val="0"/>
       </w:pPr>
       <w:r>
         <w:rPr>
@@ -9477,6 +9948,7 @@
     <w:p>
       <w:pPr>
         <w:pStyle w:val="3"/>
+        <w:bidi w:val="0"/>
       </w:pPr>
       <m:oMathPara>
         <m:oMathParaPr>
@@ -9484,26 +9956,35 @@
         </m:oMathParaPr>
         <m:oMath>
           <m:r>
-            <m:rPr/>
-            <m:t>E</m:t>
-          </m:r>
-          <m:r>
             <m:rPr>
               <m:sty m:val="p"/>
             </m:rPr>
-            <m:t>=</m:t>
+            <w:rPr>
+              <w:rFonts w:ascii="Times New Roman" w:hAnsi="Times New Roman"/>
+            </w:rPr>
+            <m:t>E=</m:t>
           </m:r>
           <m:f>
             <m:fPr/>
             <m:num>
               <m:r>
-                <m:rPr/>
+                <m:rPr>
+                  <m:sty m:val="p"/>
+                </m:rPr>
+                <w:rPr>
+                  <w:rFonts w:ascii="Times New Roman" w:hAnsi="Times New Roman"/>
+                </w:rPr>
                 <m:t>100</m:t>
               </m:r>
             </m:num>
             <m:den>
               <m:r>
-                <m:rPr/>
+                <m:rPr>
+                  <m:sty m:val="p"/>
+                </m:rPr>
+                <w:rPr>
+                  <w:rFonts w:ascii="Times New Roman" w:hAnsi="Times New Roman"/>
+                </w:rPr>
                 <m:t>300</m:t>
               </m:r>
             </m:den>
@@ -9512,31 +9993,10 @@
             <m:rPr>
               <m:sty m:val="p"/>
             </m:rPr>
-            <m:t>×</m:t>
-          </m:r>
-          <m:r>
-            <m:rPr/>
-            <m:t>100</m:t>
-          </m:r>
-          <m:r>
-            <m:rPr>
-              <m:sty m:val="p"/>
-            </m:rPr>
-            <m:t>=</m:t>
-          </m:r>
-          <m:r>
-            <m:rPr/>
-            <m:t>33.3 kWh</m:t>
-          </m:r>
-          <m:r>
-            <m:rPr>
-              <m:sty m:val="p"/>
-            </m:rPr>
-            <m:t>/</m:t>
-          </m:r>
-          <m:r>
-            <m:rPr/>
-            <m:t>100km</m:t>
+            <w:rPr>
+              <w:rFonts w:ascii="Times New Roman" w:hAnsi="Times New Roman"/>
+            </w:rPr>
+            <m:t>×100=33.3 kWh/100km</m:t>
           </m:r>
         </m:oMath>
       </m:oMathPara>
@@ -10056,8 +10516,6 @@
         </w:rPr>
         <w:t>吨级轻卡</w:t>
       </w:r>
-      <w:bookmarkStart w:id="44" w:name="_GoBack"/>
-      <w:bookmarkEnd w:id="44"/>
     </w:p>
     <w:p>
       <w:pPr>
@@ -10101,6 +10559,7 @@
     <w:p>
       <w:pPr>
         <w:pStyle w:val="3"/>
+        <w:bidi w:val="0"/>
       </w:pPr>
       <w:r>
         <w:rPr>
@@ -10814,9 +11273,9 @@
         </w:tblCellMar>
       </w:tblPr>
       <w:tblGrid>
-        <w:gridCol w:w="990"/>
-        <w:gridCol w:w="1159"/>
-        <w:gridCol w:w="6707"/>
+        <w:gridCol w:w="1011"/>
+        <w:gridCol w:w="1167"/>
+        <w:gridCol w:w="6678"/>
       </w:tblGrid>
       <w:tr>
         <w:tblPrEx>
@@ -11199,6 +11658,7 @@
     <w:p>
       <w:pPr>
         <w:pStyle w:val="3"/>
+        <w:bidi w:val="0"/>
       </w:pPr>
       <w:r>
         <w:rPr>
@@ -11210,6 +11670,7 @@
     <w:p>
       <w:pPr>
         <w:pStyle w:val="3"/>
+        <w:bidi w:val="0"/>
       </w:pPr>
       <m:oMathPara>
         <m:oMathParaPr>
@@ -11217,60 +11678,35 @@
         </m:oMathParaPr>
         <m:oMath>
           <m:r>
-            <m:rPr/>
-            <m:t>V</m:t>
-          </m:r>
-          <m:r>
             <m:rPr>
               <m:sty m:val="p"/>
             </m:rPr>
-            <m:t>=</m:t>
-          </m:r>
-          <m:r>
-            <m:rPr/>
-            <m:t>4.15</m:t>
-          </m:r>
-          <m:r>
-            <m:rPr>
-              <m:sty m:val="p"/>
-            </m:rPr>
-            <m:t>×</m:t>
-          </m:r>
-          <m:r>
-            <m:rPr/>
-            <m:t>2.10</m:t>
-          </m:r>
-          <m:r>
-            <m:rPr>
-              <m:sty m:val="p"/>
-            </m:rPr>
-            <m:t>×</m:t>
-          </m:r>
-          <m:r>
-            <m:rPr/>
-            <m:t>2.10</m:t>
-          </m:r>
-          <m:r>
-            <m:rPr>
-              <m:sty m:val="p"/>
-            </m:rPr>
-            <m:t>≈</m:t>
-          </m:r>
-          <m:r>
-            <m:rPr/>
-            <m:t>18.3 </m:t>
+            <w:rPr>
+              <w:rFonts w:ascii="Times New Roman" w:hAnsi="Times New Roman"/>
+            </w:rPr>
+            <m:t>V=4.15×2.10×2.10≈18.3 </m:t>
           </m:r>
           <m:sSup>
             <m:sSupPr/>
             <m:e>
               <m:r>
-                <m:rPr/>
+                <m:rPr>
+                  <m:sty m:val="p"/>
+                </m:rPr>
+                <w:rPr>
+                  <w:rFonts w:ascii="Times New Roman" w:hAnsi="Times New Roman"/>
+                </w:rPr>
                 <m:t>m</m:t>
               </m:r>
             </m:e>
             <m:sup>
               <m:r>
-                <m:rPr/>
+                <m:rPr>
+                  <m:sty m:val="p"/>
+                </m:rPr>
+                <w:rPr>
+                  <w:rFonts w:ascii="Times New Roman" w:hAnsi="Times New Roman"/>
+                </w:rPr>
                 <m:t>3</m:t>
               </m:r>
             </m:sup>
@@ -11623,26 +12059,13 @@
     <w:p>
       <w:pPr>
         <w:pStyle w:val="3"/>
-      </w:pPr>
-      <w:r>
-        <w:rPr>
-          <w:rFonts w:hint="eastAsia"/>
-        </w:rPr>
-        <w:t>尤其是</w:t>
-      </w:r>
-      <w:r>
-        <w:rPr>
-          <w:rFonts w:hint="eastAsia"/>
-          <w:b/>
-          <w:bCs/>
-        </w:rPr>
-        <w:t>车架、悬架、制动、转向、车轮</w:t>
-      </w:r>
-      <w:r>
-        <w:rPr>
-          <w:rFonts w:hint="eastAsia"/>
-        </w:rPr>
-        <w:t>，最好都写一小节。</w:t>
+        <w:bidi w:val="0"/>
+      </w:pPr>
+      <w:r>
+        <w:rPr>
+          <w:rFonts w:hint="eastAsia"/>
+        </w:rPr>
+        <w:t>尤其是车架、悬架、制动、转向、车轮，最好都写一小节。</w:t>
       </w:r>
     </w:p>
     <w:p>
@@ -11787,6 +12210,7 @@
     <w:p>
       <w:pPr>
         <w:pStyle w:val="3"/>
+        <w:bidi w:val="0"/>
       </w:pPr>
       <w:r>
         <w:rPr>
@@ -11963,6 +12387,7 @@
     <w:p>
       <w:pPr>
         <w:pStyle w:val="3"/>
+        <w:bidi w:val="0"/>
       </w:pPr>
       <w:r>
         <w:rPr>
@@ -12886,10 +13311,21 @@
           <w:p>
             <w:pPr>
               <w:pStyle w:val="25"/>
+              <w:rPr>
+                <w:rFonts w:hint="default" w:eastAsia="宋体"/>
+                <w:lang w:val="en-US" w:eastAsia="zh-CN"/>
+              </w:rPr>
             </w:pPr>
             <w:r>
               <w:t>120kW</w:t>
             </w:r>
+            <w:r>
+              <w:rPr>
+                <w:rFonts w:hint="eastAsia"/>
+                <w:lang w:val="en-US" w:eastAsia="zh-CN"/>
+              </w:rPr>
+              <w:t>nn</w:t>
+            </w:r>
           </w:p>
         </w:tc>
       </w:tr>
@@ -13053,6 +13489,7 @@
     <w:p>
       <w:pPr>
         <w:pStyle w:val="3"/>
+        <w:bidi w:val="0"/>
       </w:pPr>
       <w:r>
         <w:rPr>
@@ -13393,6 +13830,7 @@
     <w:p>
       <w:pPr>
         <w:pStyle w:val="3"/>
+        <w:bidi w:val="0"/>
       </w:pPr>
       <w:r>
         <w:rPr>
@@ -13439,6 +13877,7 @@
     <w:p>
       <w:pPr>
         <w:pStyle w:val="3"/>
+        <w:bidi w:val="0"/>
       </w:pPr>
       <w:r>
         <w:rPr>
@@ -14412,7 +14851,7 @@
   <w:docDefaults>
     <w:rPrDefault>
       <w:rPr>
-        <w:rFonts w:asciiTheme="minorHAnsi" w:hAnsiTheme="minorHAnsi" w:eastAsiaTheme="minorEastAsia" w:cstheme="minorBidi"/>
+        <w:rFonts w:ascii="Times New Roman" w:hAnsi="Times New Roman" w:eastAsia="宋体" w:cs="Times New Roman"/>
       </w:rPr>
     </w:rPrDefault>
     <w:pPrDefault/>
@@ -14420,7 +14859,7 @@
   <w:latentStyles w:count="260" w:defQFormat="0" w:defUnhideWhenUsed="1" w:defSemiHidden="1" w:defUIPriority="99" w:defLockedState="0">
     <w:lsdException w:qFormat="1" w:unhideWhenUsed="0" w:uiPriority="0" w:semiHidden="0" w:name="Normal"/>
     <w:lsdException w:qFormat="1" w:unhideWhenUsed="0" w:uiPriority="9" w:semiHidden="0" w:name="heading 1"/>
-    <w:lsdException w:qFormat="1" w:uiPriority="9" w:name="heading 2"/>
+    <w:lsdException w:qFormat="1" w:uiPriority="9" w:semiHidden="0" w:name="heading 2"/>
     <w:lsdException w:qFormat="1" w:uiPriority="9" w:name="heading 3"/>
     <w:lsdException w:qFormat="1" w:uiPriority="9" w:name="heading 4"/>
     <w:lsdException w:qFormat="1" w:uiPriority="9" w:name="heading 5"/>
@@ -14706,7 +15145,6 @@
     <w:basedOn w:val="1"/>
     <w:next w:val="3"/>
     <w:link w:val="33"/>
-    <w:semiHidden/>
     <w:unhideWhenUsed/>
     <w:qFormat/>
     <w:uiPriority w:val="9"/>

</xml_diff>